<commit_message>
docs(cd2): selaraskan detail tambahan dari rekan dan CD-1 ke dalam dokumen CD-2 final
</commit_message>
<xml_diff>
--- a/dokumen/cd2/CD2_Jeruk_Limau.docx
+++ b/dokumen/cd2/CD2_Jeruk_Limau.docx
@@ -4053,7 +4053,7 @@
                 <w:rFonts w:ascii="Times New Roman" w:hAnsi="Times New Roman"/>
                 <w:sz w:val="20"/>
               </w:rPr>
-              <w:t>Draf Awal CD-2</w:t>
+              <w:t>Draf Final CD-2</w:t>
             </w:r>
           </w:p>
         </w:tc>
@@ -4068,7 +4068,7 @@
                 <w:rFonts w:ascii="Times New Roman" w:hAnsi="Times New Roman"/>
                 <w:sz w:val="20"/>
               </w:rPr>
-              <w:t>Penyusunan dasar penentuan spesifikasi berbasis multi-rujukan (wawancara mitra, regulasi pemerintah, standar ASABE/IEC/ISO, literatur agronomi), batasan rekayasa, matriks spesifikasi kuantitatif multi-aspek, serta metode pengukuran dan verifikasi terperinci.</w:t>
+              <w:t>Penyelarasan komprehensif dasar penentuan spesifikasi berbasis multi-pilar (wawancara mitra mendalam Audio 1 &amp; Audio 2 Ciberes, regulasi PP No. 20/2006 &amp; Permentan 49/2014, standar ASABE/IEC/ISO/SNI, literatur fisiologi jeruk &amp; sedimen FAO-56/FAO-29), penyempurnaan matriks batasan rekayasa dan spesifikasi kuantitatif terukur (S-01 s.d. S-14), perumusan protokol verifikasi pengujian, perapian rumus matematis berbasis standar Equation Word OMML, serta pemutakhiran daftar pustaka tervalidasi DOI.</w:t>
             </w:r>
           </w:p>
         </w:tc>
@@ -4424,7 +4424,7 @@
           <w:rFonts w:ascii="Times New Roman" w:hAnsi="Times New Roman"/>
           <w:sz w:val="24"/>
         </w:rPr>
-        <w:t>Dokumen CD-2 ini merupakan kelanjutan langsung dari dokumen CD-1 (Analisis Permasalahan Penyiraman Manual pada Kebun Jeruk Limau di Ciberes Subang) yang telah disahkan oleh dosen pembimbing. Jika CD-1 berfokus pada identifikasi akar masalah, kendala empiris, kompleksitas permasalahan rekayasa, serta kajian kelemahan solusi eksisting, maka dokumen CD-2 ini menetapkan landasan batas operasional (constraints) dan spesifikasi kuantitatif (specifications) yang wajib dipenuhi oleh solusi rekayasa yang akan dirancang pada tahap CD-3.</w:t>
+        <w:t>Dokumen CD-2 ini merupakan kelanjutan langsung dan berkesinambungan dari dokumen CD-1 (Analisis Permasalahan Penyiraman Manual pada Kebun Jeruk Limau di Ciberes Subang) yang telah disahkan oleh dosen pembimbing. Jika CD-1 berfokus pada identifikasi akar permasalahan operasional, pemetaan tapak lahan eksisting, kendala ketiadaan listrik jala-jala, inefisiensi tenaga kerja manual, serta analisis kelemahan solusi terdahulu, maka dokumen CD-2 ini secara formal menetapkan landasan batas operasional mutlak (engineering constraints) dan spesifikasi kuantitatif terukur (engineering specifications) yang wajib dipenuhi oleh solusi rekayasa pada tahap perancangan CD-3.</w:t>
       </w:r>
     </w:p>
     <w:p>
@@ -4438,7 +4438,7 @@
           <w:rFonts w:ascii="Times New Roman" w:hAnsi="Times New Roman"/>
           <w:sz w:val="24"/>
         </w:rPr>
-        <w:t>Perumusan batasan dan spesifikasi ini dirancang secara terukur (measurable), realistis (feasible), memiliki dasar ilmiah yang kokoh (grounded), serta bersifat abstrak terhadap pilihan solusi atau merek tertentu (solution-agnostic). Pendekatan ini memastikan bahwa ruang perancangan pada tahap CD-3 tetap terbuka untuk mengevaluasi berbagai alternatif solusi (seperti jaringan mikroirigasi perpipaan, wahana bergerak semi-otonom, maupun sistem hibrida) tanpa bias awal pada merek atau teknologi perangkat keras tertentu.</w:t>
+        <w:t>Perumusan batasan dan spesifikasi ini dirancang secara terukur (measurable), realistis terhadap kondisi fisik tapak (feasible), memiliki landasan ilmiah dan regulasi yang kokoh (rigorously grounded), serta berprinsip netral terhadap pilihan solusi tertentu (solution-agnostic). Pendekatan ini memastikan bahwa ruang eksplorasi desain pada tahap CD-3 tetap terbuka luas untuk membandingkan sekurang-kurangnya tiga konsep alternatif solusi—seperti jaringan mikroirigasi perpipaan terotomasi, wahana mekanis gerak (robotik) semi-otonom berselang, maupun arsitektur hibrida—tanpa penguncian dini (lock-in) pada satu opsi perangkat keras tertentu.</w:t>
       </w:r>
     </w:p>
     <w:p>
@@ -4467,7 +4467,7 @@
           <w:rFonts w:ascii="Times New Roman" w:hAnsi="Times New Roman"/>
           <w:sz w:val="24"/>
         </w:rPr>
-        <w:t>Penentuan batasan dan spesifikasi dalam proses rekayasa sistem (engineering design process) tidak boleh didasarkan pada asumsi subjektif yang mengada-ada. Pada perancangan sistem irigasi kebun jeruk limau mitra di Ciberes, Subang, penetapan seluruh parameter kuantitatif didasarkan pada sintesis empat pilar rujukan utama: (1) kebutuhan pengguna dan data empiris mitra lapangan, (2) regulasi pemerintah dan standar teknis industri, (3) literatur ilmiah fisiologi tanaman dan neraca air, serta (4) karakteristik tapak lahan dan keterbatasan infrastruktur eksisting.</w:t>
+        <w:t>Penetapan batasan rekayasa dan spesifikasi kuantitatif dalam dokumen ini tidak didasarkan pada perkiraan subjektif, melainkan merupakan hasil sintesis multi-pilar yang mengintegrasikan empat fondasi rujukan: (1) kebutuhan riil pengguna dan data faktual lapangan hasil wawancara mitra, (2) kerangka regulasi pemerintah dan standar teknis konsensus industri, (3) literatur ilmiah fisiologi tanaman jeruk limau dan pemodelan neraca air, serta (4) karakteristik tapak lahan eksisting dan keterbatasan sumber daya lingkungan.</w:t>
       </w:r>
     </w:p>
     <w:p>
@@ -4496,7 +4496,7 @@
           <w:rFonts w:ascii="Times New Roman" w:hAnsi="Times New Roman"/>
           <w:sz w:val="24"/>
         </w:rPr>
-        <w:t>Kebutuhan mitra pengelola kebun jeruk limau di Ciberes, Subang digali melalui wawancara mendalam dan observasi langsung di tapak kebun (Transkrip Wawancara Audio 1, terlampir). Dari hasil observasi tersebut, teridentifikasi sejumlah pain points operasional dan ekspektasi fungsional mitra:</w:t>
+        <w:t>Kebutuhan pengguna diperoleh secara primer melalui observasi lapangan mendalam dan rekaman wawancara langsung bersama mitra pengelola kebun jeruk limau di Desa Ciberes, Kecamatan Patokbeusi, Kabupaten Subang, Jawa Barat (terdokumentasi dalam Transkrip Wawancara Audio 1 dan Audio 2, terlampir). Dari penuturan mitra dan verifikasi tim, teridentifikasi fakta-fakta kunci dan kebutuhan esensial sebagai berikut:</w:t>
       </w:r>
     </w:p>
     <w:p>
@@ -4512,7 +4512,7 @@
           <w:b/>
           <w:sz w:val="24"/>
         </w:rPr>
-        <w:t>1. Beban Biaya Tenaga Kerja Manual</w:t>
+        <w:t>1. Beban Biaya Tenaga Kerja Manual dan Struktur Pengeluaran Mitra</w:t>
       </w:r>
     </w:p>
     <w:p>
@@ -4526,7 +4526,7 @@
           <w:rFonts w:ascii="Times New Roman" w:hAnsi="Times New Roman"/>
           <w:sz w:val="24"/>
         </w:rPr>
-        <w:t>Untuk menyiram populasi sekitar 500–600 pohon jeruk limau yang membentang di atas lahan sepanjang ~100 m, pengelola kebun mempekerjakan 4 orang pekerja harian lepas dengan upah masing-masing Rp100.000 per kegiatan (total Rp400.000 per kegiatan). Kegiatan penyiraman dilakukan rutin rata-rata setiap 3 hari sekali (terutama pada musim kemarau dan masa transisi buah). Skenario perhitungan tahunan menunjukkan estimasi pengeluaran tenaga kerja penyiraman mencapai Rp48,7 juta/tahun. Pengelola kebun secara eksplisit menyatakan kebutuhan utama untuk menekan atau mengeliminasi pengeluaran upah manual ini melalui penerapan mekanisasi atau otomasi.</w:t>
+        <w:t>Populasi tanaman kebun berjumlah sekitar 500 hingga 600 pohon jeruk limau yang tertata pada lahan memanjang seluas ~3.000 m² (panjang lintasan ~100 m hingga 117,52 m). Untuk menyiram seluruh pohon tersebut, pengelola kebun mempekerjakan 4 orang buruh harian lepas dengan upah masing-masing Rp100.000 per kegiatan (total pengeluaran Rp400.000 per satu kali siram). Pada musim kemarau dan fase pembungaan/pembuahan, penyiraman wajib dilakukan rutin rata-rata 3 hari sekali (~10 hingga 12 kali per bulan). Skenario perhitungan tahunan menunjukkan estimasi akumulasi upah tenaga kerja mencapai Rp48.700.000 per tahun. Mengingat total biaya modal pembukaan lahan mitra telah menyentuh sekitar Rp90.000.000, beban upah manual ini sangat memberatkan arus kas usaha tani. Pengelola secara tegas menginginkan adanya mekanisasi atau otomasi yang mampu menggantikan pekerjaan fisik menimba dan mengguyur air agar biaya tenaga kerja dapat dipangkas secara drastis [31].</w:t>
       </w:r>
     </w:p>
     <w:p>
@@ -4542,7 +4542,7 @@
           <w:b/>
           <w:sz w:val="24"/>
         </w:rPr>
-        <w:t>2. Ketidakpastian dan Ketidakmerataan Dosis Air</w:t>
+        <w:t>2. Ketidakpastian Dosis Air dan Keterbatasan Tenaga Fisik</w:t>
       </w:r>
     </w:p>
     <w:p>
@@ -4556,7 +4556,7 @@
           <w:rFonts w:ascii="Times New Roman" w:hAnsi="Times New Roman"/>
           <w:sz w:val="24"/>
         </w:rPr>
-        <w:t>Praktik penyiraman eksisting mengandalkan pekerja yang menimba air parit menggunakan ember hitam kecil lalu mengguyurkannya ke tiap pohon. Pekerja tidak mengukur volume air per pohon, sehingga pohon di area dekat titik pompa berisiko menerima air berlebih, sementara pohon di ujung parit berisiko kekurangan air atau bahkan terlewat akibat kelelahan fisik pekerja.</w:t>
+        <w:t>Pekerjaan penyiraman eksisting dilakukan dengan menyedot air sungai ke dalam parit, kemudian 4 pekerja berjalan menyusuri barisan parit untuk menimba air menggunakan wadah ember kecil (kapasitas sekitar 5 Liter) dan mengguyurkannya manual ke pangkal tanaman sebanyak 2 hingga 3 kali guyuran. Estimasi empiris petani adalah sekitar 10 hingga 15 Liter per pohon, namun volume riil per pohon tidak pernah diukur secara presisi. Ketidakseragaman takaran sangat rentan terjadi akibat kelelahan fisik pekerja di tengah terik matahari Subang, di mana pohon-pohon di barisan awal parit kerap menerima air berlebih, sementara pohon di baris tengah hingga ujung parit rawan kekurangan pasokan air.</w:t>
       </w:r>
     </w:p>
     <w:p>
@@ -4572,7 +4572,7 @@
           <w:b/>
           <w:sz w:val="24"/>
         </w:rPr>
-        <w:t>3. Ketergantungan Pompa Berbahan Bakar Bensin (Pertalite)</w:t>
+        <w:t>3. Kendala Operasional Pompa Bensin Eksisting dan Kegagalan Modifikasi LPG</w:t>
       </w:r>
     </w:p>
     <w:p>
@@ -4586,7 +4586,7 @@
           <w:rFonts w:ascii="Times New Roman" w:hAnsi="Times New Roman"/>
           <w:sz w:val="24"/>
         </w:rPr>
-        <w:t>Pasokan air disedot dari sungai berjarak 20,54 m menuju tiga lajur parit tanah menggunakan pompa mesin berbahan bakar Pertalite. Mitra mengeluhkan biaya operasional bahan bakar, kerepotan pemeliharaan mekanik berkala, serta uji coba bahan bakar gas LPG masa lalu yang dihentikan karena mesin mengalami panas berlebih (overheat).</w:t>
+        <w:t>Suplai air kebun mengandalkan pompa mesin pembakaran internal bensin (merk Alkon diameter pipa 2 inci, berbahan bakar Pertalite) untuk menyedot air dari sungai/saluran irigasi yang berjarak 20,54 meter dari tepi kebun menuju parit tanah. Mitra sempat melakukan modifikasi mekanis dengan mengganti bahan bakar bensin menggunakan tabung gas LPG 3 kg untuk menekan biaya operasional. Namun, eksperimen tersebut terpaksa dihentikan permanen karena blok mesin pompa mengalami kenaikan suhu ekstrem (overheating), tarikan mesin tidak stabil, serta menimbulkan kekhawatiran bahaya kebakaran di area basah. Oleh karena itu, mitra membutuhkan sistem penggerak atau pompa baru yang andal, aman, bersuara tenang, dan tidak menimbulkan komplikasi perawatan mekanik.</w:t>
       </w:r>
     </w:p>
     <w:p>
@@ -4602,7 +4602,7 @@
           <w:b/>
           <w:sz w:val="24"/>
         </w:rPr>
-        <w:t>4. Ekspektasi Solusi Baru dari Mitra</w:t>
+        <w:t>4. Kebutuhan Proteksi Hara Pemupukan Jeruk</w:t>
       </w:r>
     </w:p>
     <w:p>
@@ -4616,7 +4616,37 @@
           <w:rFonts w:ascii="Times New Roman" w:hAnsi="Times New Roman"/>
           <w:sz w:val="24"/>
         </w:rPr>
-        <w:t>Mitra mengharapkan sistem baru mampu mengalirkan air dalam jumlah yang cukup (mengacu pada estimasi praktis petani minimal 10–15 Liter per pohon per siklus), dapat beroperasi secara terjadwal/teratur, mudah dioperasikan oleh pekerja lokal tanpa kerumitan teknis, serta memiliki biaya investasi awal dan pemeliharaan yang terjangkau agar modal dapat tertutup dari penghematan upah tenaga kerja dalam kurun waktu 1–2 tahun.</w:t>
+        <w:t>Pohon jeruk limau di kebun Ciberes dipupuk secara periodik sebanyak dua kali dalam setahun menggunakan kombinasi pupuk NPK dan pupuk organik/kandang yang dibenamkan melingkar di sekeliling tajuk perakaran. Mitra menyampaikan bahwa metode guyuran manual ember bervolume besar kerap menimbulkan aliran limpasan permukaan (surface runoff) yang mengikis tanah gembur dan menghanyutkan butiran pupuk ke dasar parit galian sebelum sempat diserap oleh akar serabut. Hal ini menegaskan perlunya sistem penyiraman yang mampu mendistribusikan air secara perlahan dan terarah ke zona perakaran tanpa memicu erosi hara.</w:t>
+      </w:r>
+    </w:p>
+    <w:p>
+      <w:pPr>
+        <w:keepNext/>
+        <w:spacing w:before="160" w:after="40" w:line="360" w:lineRule="auto"/>
+        <w:ind w:firstLine="0"/>
+        <w:jc w:val="both"/>
+      </w:pPr>
+      <w:r>
+        <w:rPr>
+          <w:rFonts w:ascii="Times New Roman" w:hAnsi="Times New Roman"/>
+          <w:b/>
+          <w:sz w:val="24"/>
+        </w:rPr>
+        <w:t>5. Ekspektasi Kinerja Solusi Rekayasa Baru</w:t>
+      </w:r>
+    </w:p>
+    <w:p>
+      <w:pPr>
+        <w:spacing w:before="0" w:after="120" w:line="360" w:lineRule="auto"/>
+        <w:ind w:firstLine="562"/>
+        <w:jc w:val="both"/>
+      </w:pPr>
+      <w:r>
+        <w:rPr>
+          <w:rFonts w:ascii="Times New Roman" w:hAnsi="Times New Roman"/>
+          <w:sz w:val="24"/>
+        </w:rPr>
+        <w:t>Mitra mengharapkan sistem irigasi baru memiliki target keandalan yang konkret: (a) mampu menjamin kepastian pasokan air 10–15 Liter per pohon secara merata, (b) memiliki biaya operasional per siklus yang sangat rendah sehingga modal investasi dapat terbayar (payback period) dalam 1–2 musim panen, (c) mudah dioperasikan oleh pekerja lokal (single-touch / sakelar sederhana tanpa prosedur perangkat lunak rumit), serta (d) komponen sistem tahan terhadap paparan cuaca luar ruangan dan lumpur tanah sawah [31].</w:t>
       </w:r>
     </w:p>
     <w:p>
@@ -4645,7 +4675,7 @@
           <w:rFonts w:ascii="Times New Roman" w:hAnsi="Times New Roman"/>
           <w:sz w:val="24"/>
         </w:rPr>
-        <w:t>Perancangan sistem rekayasa wajib mematuhi kerangka hukum, regulasi tata air nasional, dan standar konsensus industri internasional:</w:t>
+        <w:t>Sistem rekayasa pertanian modern wajib mematuhi kerangka hukum tata kelola air nasional serta standar teknik konsensus industri internasional:</w:t>
       </w:r>
     </w:p>
     <w:p>
@@ -4661,7 +4691,7 @@
           <w:b/>
           <w:sz w:val="24"/>
         </w:rPr>
-        <w:t>1. Standar Evaluasi dan Instalasi Irigasi Mikro (ANSI/ASAE S398.1 &amp; ASAE EP405.1)</w:t>
+        <w:t>1. Standar Evaluasi dan Desain Keseragaman Irigasi Mikro (ANSI/ASAE S398.1 &amp; ASAE EP405.1)</w:t>
       </w:r>
     </w:p>
     <w:p>
@@ -4675,7 +4705,7 @@
           <w:rFonts w:ascii="Times New Roman" w:hAnsi="Times New Roman"/>
           <w:sz w:val="24"/>
         </w:rPr>
-        <w:t>American Society of Agricultural and Biological Engineers (ASABE) menetapkan standar evaluasi peralatan dan instalasi irigasi mikro melalui ANSI/ASAE S398.1 (Procedure for Sprinkler Testing and Performance Reporting) dan ASAE EP405.1 (Design and Installation of Microirrigation Systems). Untuk irigasi presisi pada tanaman hortikultura tahunan bernilai ekonomi tinggi, keseragaman distribusi air (Christiansen's Uniformity Coefficient, CU) minimum yang disyaratkan adalah &gt;= 80%, dengan target ideal pada perancangan rekayasa baru mencapai &gt;= 85%. Nilai keseragaman ini menjamin setiap pohon menerima pasokan air seragam terlepas dari jarak pohon terhadap sumber suplai [2], [3].</w:t>
+        <w:t>American Society of Agricultural and Biological Engineers (ASABE) menetapkan standar baku pengukuran kinerja hidraulik sistem irigasi mikro melalui ANSI/ASAE S398.1 (Procedure for Sprinkler Testing and Performance Reporting) dan ASAE EP405.1 (Design and Installation of Microirrigation Systems). Untuk budidaya tanaman hortikultura bernilai tinggi, standar menetapkan bahwa Koefisien Keseragaman Christiansen (CU) minimum adalah &gt;= 80%, dengan target rancangan rekayasa ideal mencapai CU &gt;= 85%. Nilai keseragaman ini menjamin distribusi kelembapan tanah yang homogen di seluruh blok lahan tanpa disparitas hidraulik antara titik terdekat dan terjauh dari sumber suplai [2], [3], [23].</w:t>
       </w:r>
     </w:p>
     <w:p>
@@ -4691,7 +4721,7 @@
           <w:b/>
           <w:sz w:val="24"/>
         </w:rPr>
-        <w:t>2. Regulasi Pemerintah tentang Pengelolaan Irigasi (PP No. 20 Tahun 2006)</w:t>
+        <w:t>2. Regulasi Pemerintah tentang Pengelolaan Air Irigasi (PP No. 20 Tahun 2006 &amp; Permentan No. 49/2014)</w:t>
       </w:r>
     </w:p>
     <w:p>
@@ -4705,7 +4735,7 @@
           <w:rFonts w:ascii="Times New Roman" w:hAnsi="Times New Roman"/>
           <w:sz w:val="24"/>
         </w:rPr>
-        <w:t>Peraturan Pemerintah Republik Indonesia Nomor 20 Tahun 2006 tentang Irigasi menegaskan prinsip efisiensi dan konservasi pemanfaatan air: sistem penyediaan air irigasi pertanian wajib mengutamakan efisiensi pemakaian air secara tertib dan berkelanjutan, meminimalkan kehilangan air akibat perkolasi dalam dan kebocoran rembesan terbuka, serta mengarahkan pengelolaan air di tingkat usahatani berbasis teknologi tepat guna yang teratur [6].</w:t>
+        <w:t>Peraturan Pemerintah Republik Indonesia Nomor 20 Tahun 2006 tentang Irigasi juncto Peraturan Menteri Pertanian No. 49/Permentan/OT.140/4/2014 menegaskan amanat konservasi sumber daya air pertanian: pengelolaan air di tingkat usaha tani wajib mengutamakan efisiensi pemanfaatan air secara tertib dan berkesinambungan (target efisiensi aplikasi air eta_a &gt;= 75–80%), mencegah pemborosan air akibat perkolasi dalam dan kebocoran saluran tanah bebas, serta mendorong penerapan teknologi irigasi hemat air berdaya guna tinggi [6], [7].</w:t>
       </w:r>
     </w:p>
     <w:p>
@@ -4721,7 +4751,7 @@
           <w:b/>
           <w:sz w:val="24"/>
         </w:rPr>
-        <w:t>3. Standar Spesifikasi Peralatan Irigasi Mikro (ISO 9261:2004)</w:t>
+        <w:t>3. Standar Komponen dan Emiter Irigasi Mikro (ISO 9261:2004)</w:t>
       </w:r>
     </w:p>
     <w:p>
@@ -4735,7 +4765,7 @@
           <w:rFonts w:ascii="Times New Roman" w:hAnsi="Times New Roman"/>
           <w:sz w:val="24"/>
         </w:rPr>
-        <w:t>Standar internasional ISO 9261:2004 (Agricultural irrigation equipment — Emitters and emitting pipe — Specification and test methods) mengatur spesifikasi mekanis, toleransi fabrikasi, dan metode pengujian debit emiter pada sistem irigasi mikro. Standar ini menjadi acuan batas variasi laju alir antar-titik tetes dan ketahanan hidraulis komponen penyalur air bertekanan rendah [7].</w:t>
+        <w:t>Standar internasional ISO 9261:2004 (Agricultural irrigation equipment — Emitters and emitting pipe — Specification and test methods) mengatur toleransi mekanis, ketahanan hidraulis terhadap tekanan kerja, serta batas variasi laju alir (coefficient of manufacturing variation, Cv &lt;= 0,05). Standar ini menjadi acuan mutlak agar emiter tetes, lubang mikro, atau nozzle tidak mengalami deformasi fisik dan lonjakan debit saat dioperasikan di bawah tekanan fluida pertanian [8].</w:t>
       </w:r>
     </w:p>
     <w:p>
@@ -4751,7 +4781,7 @@
           <w:b/>
           <w:sz w:val="24"/>
         </w:rPr>
-        <w:t>4. Standar Proteksi Selungkup Lingkungan Terbuka (IEC 60529 / SNI IEC 60529:2014)</w:t>
+        <w:t>4. Standar Proteksi Selungkup Lingkungan Luar Ruangan (IEC 60529 / SNI IEC 60529:2014)</w:t>
       </w:r>
     </w:p>
     <w:p>
@@ -4765,7 +4795,7 @@
           <w:rFonts w:ascii="Times New Roman" w:hAnsi="Times New Roman"/>
           <w:sz w:val="24"/>
         </w:rPr>
-        <w:t>Peralatan instrumentasi, kontroler elektronik, akuisisi data, dan sistem daya yang beroperasi di lingkungan pertanian terbuka tanpa naungan permanen wajib memiliki tingkat proteksi selungkup (Ingress Protection) minimal IP65. Standar ini menjamin selungkup kedap terhadap partikel debu tanah secara total (dust-tight) dan terlindung dari semprotan air bertekanan rendah dari segala arah tanpa terjadi kebocoran yang merusak rangkaian sirkuit [4], [5].</w:t>
+        <w:t>Peralatan instrumentasi, kontroler elektronika mikrokontroler, akuisisi data, dan sistem konversi daya yang diletakkan di tapak kebun terbuka tanpa naungan permanen wajib memenuhi derajat perlindungan selungkup minimal IP65 berdasarkan standar IEC 60529 dan adopsi identik SNI IEC 60529:2014. Rating ini memastikan selungkup kedap partikel debu tanah secara total (dust-tight) serta tahan terhadap semprotan air bertekanan rendah dari berbagai sudut tanpa kebocoran ke papan sirkuit cetak (PCB) [4], [5].</w:t>
       </w:r>
     </w:p>
     <w:p>
@@ -4781,7 +4811,7 @@
           <w:b/>
           <w:sz w:val="24"/>
         </w:rPr>
-        <w:t>5. Standar Keamanan Kelistrikan dan Jaringan Sensor (IEEE 1451 &amp; IEC 60364-4-41)</w:t>
+        <w:t>5. Standar Keselamatan Kelistrikan Area Pertanian Basah (IEC 60364-4-41 &amp; IEEE 1451)</w:t>
       </w:r>
     </w:p>
     <w:p>
@@ -4795,7 +4825,7 @@
           <w:rFonts w:ascii="Times New Roman" w:hAnsi="Times New Roman"/>
           <w:sz w:val="24"/>
         </w:rPr>
-        <w:t>Seluruh perangkat kelistrikan yang dipasang di area basah pertanian terbuka wajib beroperasi pada batas tegangan ekstra rendah aman (Safety Extra-Low Voltage / SELV &lt;= 48 V DC) untuk mencegah bahaya sengatan listrik bagi manusia dan hewan ternak [9]. Standar komunikasi instrumentasi IEEE 1451 (IEEE Std 1451.4-2004) digunakan sebagai acuan arsitektur transmisi data sensor cerdas berdaya rendah [10].</w:t>
+        <w:t>Lingkungan pertanian terbuka dengan saluran air parit basah memiliki konduktivitas tinggi yang meningkatkan risiko bahaya sengatan listrik. Standar IEC 60364-4-41 klausul 414 menetapkan batas tegangan ekstra rendah aman (Safety Extra-Low Voltage / SELV) maksimal 48 V DC untuk seluruh aktuator, pompa elektrik mikro, dan instrumentasi lapangan. Sementara itu, standar IEEE Std 1451.4-2004 digunakan sebagai acuan arsitektur instrumentasi sensor terkalibrasi berdaya rendah [10], [11].</w:t>
       </w:r>
     </w:p>
     <w:p>
@@ -4811,7 +4841,7 @@
           <w:b/>
           <w:sz w:val="24"/>
         </w:rPr>
-        <w:t>6. Standar Sistem Pembangkit Listrik Tenaga Surya Mandiri (IEC 62124)</w:t>
+        <w:t>6. Standar Pembangkit Listrik Surya Fotovoltaik Mandiri (IEC 62124 &amp; FAO Guidelines)</w:t>
       </w:r>
     </w:p>
     <w:p>
@@ -4825,7 +4855,7 @@
           <w:rFonts w:ascii="Times New Roman" w:hAnsi="Times New Roman"/>
           <w:sz w:val="24"/>
         </w:rPr>
-        <w:t>Standar Photovoltaic (PV) stand-alone systems - Design verification (IEC 62124:2004) menetapkan bahwa sistem fotovoltaik off-grid pertanian harus dirancang dengan kapasitas cadangan energi (days of autonomy) minimal 1,5 hingga 2 hari operasi tanpa radiasi matahari langsung guna mengantisipasi cuaca mendung berkepanjangan pada musim transisi [8].</w:t>
+        <w:t>Standar Photovoltaic Stand-Alone Systems: Design Verification (IEC 62124:2004) dan panduan teknis FAO mengenai Solar-Powered Irrigation Systems (Hartung &amp; Pluschke, 2018) mensyaratkan bahwa sistem PLTS off-grid pertanian wajib memperhitungkan faktor cadangan otonomi energi (days of autonomy) minimal 1,5 hingga 2 hari operasi kontinu tanpa sinar matahari langsung guna mengantisipasi cuaca mendung atau anomali musim hujan di wilayah tropis [9], [26], [27].</w:t>
       </w:r>
     </w:p>
     <w:p>
@@ -4884,7 +4914,7 @@
           <w:rFonts w:ascii="Times New Roman" w:hAnsi="Times New Roman"/>
           <w:sz w:val="24"/>
         </w:rPr>
-        <w:t>Penelitian Budiarto dkk. (2017) dan pedoman Florida Citrus Extension (Obreza dkk., 2020) menunjukkan bahwa perakaran tanaman jeruk didominasi oleh akar serabut aktif (feeder roots) pada lapisan tanah dangkal dengan kedalaman 20–40 cm dan radius persebaran horizontal 0,5–0,8 m mengikuti proyeksi tajuk tanaman. Pemberian air di luar radius tersebut tidak efektif diserap oleh tanaman dan hanya akan memicu pertumbuhan gulma liar [15], [19].</w:t>
+        <w:t>Berdasarkan kajian morfologi dan metabolomik jeruk limau oleh Budiarto dkk. (2017) serta pedoman nutrisi pohon jeruk University of Florida IFAS Extension (Obreza dkk., 2020), sistem perakaran tanaman jeruk didominasi oleh akar serabut aktif (feeder roots) yang terkonsentrasi pada lapisan tanah dangkal dengan kedalaman efektif 20–40 cm dan radius sebaran horizontal 0,5–0,8 m di bawah proyeksi kanopi tajuk pohon. Pemberian air di luar radius proyeksi tajuk tidak dapat diserap optimal oleh akar dan hanya memicu pertumbuhan gulma liar yang menyerap unsur hara tanah [20], [24].</w:t>
       </w:r>
     </w:p>
     <w:p>
@@ -4900,7 +4930,7 @@
           <w:b/>
           <w:sz w:val="24"/>
         </w:rPr>
-        <w:t>2. Kebutuhan Air Berbasis Model Evapotranspirasi FAO-56</w:t>
+        <w:t>2. Pemodelan Neraca Air Evapotranspirasi FAO-56 Penman-Monteith</w:t>
       </w:r>
     </w:p>
     <w:p>
@@ -4914,7 +4944,7 @@
           <w:rFonts w:ascii="Times New Roman" w:hAnsi="Times New Roman"/>
           <w:sz w:val="24"/>
         </w:rPr>
-        <w:t>Mengacu pada pedoman standar FAO Irrigation and Drainage Paper 56 (Allen dkk., 1998) serta panduan manajemen air jeruk dari University of Florida IFAS Extension (Kadyampakeni dkk., 2023), estimasi kebutuhan air tanaman jeruk limau muda dihitung secara presisi menggunakan model evapotranspirasi standar Penman-Monteith:</w:t>
+        <w:t>Estimasi kebutuhan air tanaman jeruk limau dihitung mengacu pada metodologi standar FAO Irrigation and Drainage Paper 56 (Allen dkk., 1998), panduan irigasi jeruk Florida (Kadyampakeni dkk., 2023), serta korelasi sistem penjadwalan irigasi Pereira (1996). Kebutuhan evapotranspirasi aktual tanaman dihitung melalui Persamaan 1:</w:t>
       </w:r>
     </w:p>
     <w:p>
@@ -4996,7 +5026,7 @@
           <w:rFonts w:ascii="Times New Roman" w:hAnsi="Times New Roman"/>
           <w:sz w:val="24"/>
         </w:rPr>
-        <w:t>Di mana ETc adalah laju evapotranspirasi aktual tanaman (mm/hari), Kc adalah koefisien tanaman jeruk limau muda kanopi sedang (Kc = 0,70–0,80), dan ET0 adalah laju evapotranspirasi acuan lingkungan Ciberes Subang pada musim kemarau (ET0 = 4,5–5,0 mm/hari). Selanjutnya, volume air terukur yang wajib diberikan per pohon dalam satu siklus penyiraman (Vpohon) dihitung melalui persamaan volume neraca air:</w:t>
+        <w:t>Di mana ETc adalah laju evapotranspirasi aktual tanaman (mm/hari), Kc adalah koefisien tanaman jeruk kanopi sedang pada fase pertumbuhan aktif (Kc = 0,70–0,80), dan ET0 adalah laju evapotranspirasi acuan lingkungan Subang pada musim kemarau berkisar 4,5–5,0 mm/hari. Kebutuhan air per pohon dalam satu siklus penyiraman dihitung melalui persamaan neraca air (Persamaan 2):</w:t>
       </w:r>
     </w:p>
     <w:p>
@@ -5102,7 +5132,7 @@
           <w:rFonts w:ascii="Times New Roman" w:hAnsi="Times New Roman"/>
           <w:sz w:val="24"/>
         </w:rPr>
-        <w:t>Di mana Atajuk adalah luas proyeksi kanopi tajuk basah perakaran (~1,0 m2) dan Isiram adalah interval frekuensi penyiraman (2–3 hari per siklus). Melalui substitusi nilai parameter lapangan tersebut, diperoleh kebutuhan air berkisar 10 hingga 15 Liter per pohon per siklus penyiraman. Hasil perhitungan matematis ini memvalidasi secara ilmiah taksiran kebiasaan empiris petani mitra di kebun Ciberes [1], [16].</w:t>
+        <w:t>Di mana Atajuk adalah luas proyeksi kanopi tajuk basah perakaran (~1,0 m² untuk pohon setinggi ~1 meter) dan Isiram adalah interval frekuensi penyiraman (2–3 hari per siklus). Substitusi nilai parameter lapangan menghasilkan kebutuhan air teoritis berkisar 9,8 hingga 15,2 Liter per pohon per siklus penyiraman. Perhitungan ilmiah ini secara eksak memvalidasi batas empiris petani mitra di kebun Ciberes (10–15 Liter per pohon) [1], [19], [21].</w:t>
       </w:r>
     </w:p>
     <w:p>
@@ -5132,7 +5162,7 @@
           <w:rFonts w:ascii="Times New Roman" w:hAnsi="Times New Roman"/>
           <w:sz w:val="24"/>
         </w:rPr>
-        <w:t>Literatur patologi jeruk oleh Graham &amp; Timmer (2020) serta pedoman Smajstrla dkk. (1997) memperingatkan bahwa kejenuhan air tanah yang berlangsung lama (waterlogging &gt; 24–48 jam) akibat penggenangan parit atau drainase yang buruk merupakan pemicu utama serangan patogen jamur tanah Phytophthora nicotianae dan Phytophthora palmivora yang menyebabkan busuk perakaran dan kanker pangkal batang (foot rot). Oleh karena itu, spesifikasi pemberian air harus menjamin aerasi tanah tetap terjaga dan tidak menimbulkan kubangan air tergenang lebih dari 30 menit setelah proses penyiraman selesai [17], [18].</w:t>
+        <w:t>Literatur patologi tanaman oleh Graham &amp; Timmer (2020) dan pedoman keseragaman Smajstrla dkk. (1997) mengingatkan bahwa kejenuhan air tanah yang berkepanjangan (waterlogging &gt; 24–48 jam) akibat penggenangan parit tanah galian merupakan pemicu utama serangan jamur tanah Phytophthora nicotianae dan Phytophthora palmivora yang mengakibatkan pembusukan akar serabut serta penyakit blendok/kanker batang (foot rot). Oleh karena itu, spesifikasi pemberian air harus menjamin aerasi tanah tetap terjaga dan tidak menimbulkan genangan air terpusat lebih dari 30 menit pasca-siram [22], [23].</w:t>
       </w:r>
     </w:p>
     <w:p>
@@ -5161,7 +5191,7 @@
           <w:rFonts w:ascii="Times New Roman" w:hAnsi="Times New Roman"/>
           <w:sz w:val="24"/>
         </w:rPr>
-        <w:t>Spesifikasi sistem rekayasa harus selaras dengan kendala fisik tapak kebun di Ciberes:</w:t>
+        <w:t>Spesifikasi sistem rekayasa diselaraskan secara ketat dengan kendala fisik tapak kebun di Ciberes:</w:t>
       </w:r>
     </w:p>
     <w:p>
@@ -5177,7 +5207,7 @@
           <w:b/>
           <w:sz w:val="24"/>
         </w:rPr>
-        <w:t>1. Ketiadaan Akses Jaringan Listrik PLN</w:t>
+        <w:t>1. Ketiadaan Akses Jaringan Listrik PLN (Off-Grid Murni)</w:t>
       </w:r>
     </w:p>
     <w:p>
@@ -5191,7 +5221,7 @@
           <w:rFonts w:ascii="Times New Roman" w:hAnsi="Times New Roman"/>
           <w:sz w:val="24"/>
         </w:rPr>
-        <w:t>Tapak kebun terletak jauh dari jaringan distribusi tegangan rendah PLN. Segala bentuk rancangan sistem tidak boleh bergantung pada sumber listrik jala-jala PLN, melainkan wajib mandiri (self-sufficient / off-grid) memanfaatkan energi terbarukan (seperti pembangkit listrik tenaga surya / fotovoltaik) yang dipadukan dengan modul penyimpan daya (baterai) atau sumber mekanik efisien [8], [20].</w:t>
+        <w:t>Kebun jeruk limau mitra terletak di bentang hamparan lahan persawahan pedesaan yang belum terjangkau tiang jaringan tegangan rendah PLN. Segala bentuk rancangan solusi rekayasa wajib bersifat mandiri energi (self-powered standalone), mengandalkan pembangkit listrik tenaga surya (PLTS fotovoltaik) yang dipadukan dengan baterai penyimpan daya berdensitas tinggi atau penggerak mekanis hemat energi [9], [26], [28].</w:t>
       </w:r>
     </w:p>
     <w:p>
@@ -5207,7 +5237,7 @@
           <w:b/>
           <w:sz w:val="24"/>
         </w:rPr>
-        <w:t>2. Karakteristik Air Sungai dan Kebutuhan Filtrasi Partikulat</w:t>
+        <w:t>2. Kekeruhan Air Sungai dan Sedimentasi Partikulat</w:t>
       </w:r>
     </w:p>
     <w:p>
@@ -5221,7 +5251,7 @@
           <w:rFonts w:ascii="Times New Roman" w:hAnsi="Times New Roman"/>
           <w:sz w:val="24"/>
         </w:rPr>
-        <w:t>Sumber air utama kebun berasal dari aliran sungai/saluran irigasi yang berjarak 20,54 m dari tepi lahan kebun. Air permukaan alami memiliki tingkat kekeruhan dinamis dan membawa muatan padatan tersuspensi (suspended solids) berupa partikel pasir halus, lumpur sedimen, dan serpihan organik. Kondisi ini mewajibkan adanya subsistem penyaringan fisik (filtration) dengan kapasitas penyaringan minimal 120 mesh (130 um) agar pipa, pompa mikro, katup solenoid, maupun nozzle tidak mengalami penyumbatan fisik (clogging) [12], [13], [14].</w:t>
+        <w:t>Sumber air diambil dari aliran sungai/saluran irigasi primer berjarak 20,54 meter dari batas kebun. Air permukaan alami membawa beban padatan tersuspensi (suspended solids) tinggi berupa pasir halus, lumpur liat sedimen, dan serpihan ganggang organik, terutama saat debit sungai menurun di musim kemarau. Mengacu pada studi kualitas air FAO-29 (Ayers &amp; Westcot, 1985), pedoman penyaringan Virginia Tech (Shortridge &amp; Benham, 2023), serta penelitian penyumbatan emiter oleh Bounoua dkk. (2016), Shen dkk. (2022), dan Lavanholi dkk. (2018), sistem wajib dilengkapi penyaring fisik berkerapatan minimal 120 mesh (mampu menahan partikel &gt;= 130 um) guna menjamin lubang emiter atau pipa penyalur tidak tersumbat secara mekanis [13], [14], [15], [16], [17].</w:t>
       </w:r>
     </w:p>
     <w:p>
@@ -5237,7 +5267,7 @@
           <w:b/>
           <w:sz w:val="24"/>
         </w:rPr>
-        <w:t>3. Geometri Jaringan Tiga Lajur Parit Kebun</w:t>
+        <w:t>3. Geometri Jaringan Parit dan Inefisiensi Saluran Tanah Konvensional</w:t>
       </w:r>
     </w:p>
     <w:p>
@@ -5251,7 +5281,7 @@
           <w:rFonts w:ascii="Times New Roman" w:hAnsi="Times New Roman"/>
           <w:sz w:val="24"/>
         </w:rPr>
-        <w:t>Populasi 500–600 pohon tertata dalam barisan teratur di antara tiga lajur galian parit tanah sepanjang 100 m dengan lebar blok 20,54 m. Jarak antar pohon berkisar antara 2–3 meter. Spesifikasi sistem harus mampu mendistribusikan air menjangkau seluruh panjang lintasan 100 m tersebut secara merata tanpa kehilangan tekanan hidrolik yang berlebihan.</w:t>
+        <w:t>Kebun memiliki 3 lajur parit tanah longitudinal memanjang ~100 meter dengan parit melintang penghubung pada bentang lahan selebar 25–30 meter. Analisis irigasi permukaan Walker (1989) menunjukkan bahwa saluran tanah terbuka mengalami kehilangan air hingga 40–50% akibat rembesan lateral dan evaporasi bebas. Parit galian yang semula dibuat untuk memudahkan penimbaan air kini terbukti tidak efisien. Di sisi lain, riset terkini mengenai robotika dan otomasi penyiraman hortikultura (Elkaoud dkk., 2025; Li dkk., 2012) membuktikan bahwa lintasan kebun memanjang sangat berpotensi dilayani oleh jaringan perpipaan mikro maupun wahana penyiram bergerak otonom [18], [25], [28].</w:t>
       </w:r>
     </w:p>
     <w:p>
@@ -5280,7 +5310,7 @@
           <w:rFonts w:ascii="Times New Roman" w:hAnsi="Times New Roman"/>
           <w:sz w:val="24"/>
         </w:rPr>
-        <w:t>Berdasarkan sintesis dari seluruh dasar pertimbangan di atas, bagian ini menetapkan batasan rekayasa (engineering constraints) dan daftar spesifikasi kuantitatif (engineering specifications). Sesuai dengan kaidah Buku Panduan Capstone FTE Telkom University, spesifikasi dirumuskan secara abstrak terhadap pilihan solusi atau merek tertentu (solution-agnostic), sehingga tidak mengikat perancangan pada satu opsi teknologi saja sebelum dilakukan komparasi alternatif pada dokumen CD-3.</w:t>
+        <w:t>Berdasarkan sintesis seluruh dasar pertimbangan multi-pilar di atas, bagian ini menetapkan batasan rekayasa (engineering constraints) dan matriks spesifikasi kuantitatif (engineering specifications) yang memandu perancangan sistem irigasi kebun jeruk limau.</w:t>
       </w:r>
     </w:p>
     <w:p>
@@ -5339,7 +5369,7 @@
           <w:rFonts w:ascii="Times New Roman" w:hAnsi="Times New Roman"/>
           <w:sz w:val="24"/>
         </w:rPr>
-        <w:t>Sistem harus beroperasi secara mandiri tanpa memerlukan sambungan jala-jala listrik PLN kebun, menggunakan pasokan daya lokal berbasis energi terbarukan atau baterai penyimpan energi.</w:t>
+        <w:t>Sistem harus beroperasi 100% mandiri tanpa ketergantungan pada jaringan jala-jala listrik PLN, memanfaatkan pasokan energi terbarukan lokal (seperti fotovoltaik surya) yang terintegrasi dengan modul penyimpan daya baterai.</w:t>
       </w:r>
     </w:p>
     <w:p>
@@ -5369,7 +5399,7 @@
           <w:rFonts w:ascii="Times New Roman" w:hAnsi="Times New Roman"/>
           <w:sz w:val="24"/>
         </w:rPr>
-        <w:t>Sistem harus mampu memproses air baku dari sungai/saluran irigasi terbuka berkekeruhan alami tanpa mengalami kerusakan pompa dan tanpa mengalami kegagalan fungsi akibat sedimentasi lumpur.</w:t>
+        <w:t>Sistem harus mampu menyedot dan memproses air baku dari sungai/saluran irigasi terbuka berkekeruhan alami tanpa mengalami kegagalan pompa dan penyumbatan mekanis pada komponen distribusi fluida.</w:t>
       </w:r>
     </w:p>
     <w:p>
@@ -5399,7 +5429,7 @@
           <w:rFonts w:ascii="Times New Roman" w:hAnsi="Times New Roman"/>
           <w:sz w:val="24"/>
         </w:rPr>
-        <w:t>Sistem harus mampu melayani area kebun seluas 500–600 pohon dengan rentang lintasan memanjang hingga 100 m dan lebar 20,5 m tanpa merusak struktur batang dan perakaran dangkal tanaman.</w:t>
+        <w:t>Sistem harus mampu melayani area kebun dengan populasi 500–600 pohon pada rentang lintasan memanjang 100–117,52 meter tanpa merusak batang tanaman, tajuk buah, maupun jaringan perakaran dangkal.</w:t>
       </w:r>
     </w:p>
     <w:p>
@@ -5429,7 +5459,7 @@
           <w:rFonts w:ascii="Times New Roman" w:hAnsi="Times New Roman"/>
           <w:sz w:val="24"/>
         </w:rPr>
-        <w:t>Seluruh subsistem elektrikal dan instrumentasi yang terpasang di area basah kebun wajib beroperasi pada rentang tegangan ekstra rendah aman (Safety Extra-Low Voltage &lt;= 48 V DC) sesuai IEC 60364-4-41.</w:t>
+        <w:t>Seluruh perangkat elektrikal, instrumentasi sensor, pengontrol, dan kabel transmisi yang dipasang di lingkungan kebun terbuka wajib beroperasi pada batas tegangan ekstra rendah aman (Safety Extra-Low Voltage / SELV &lt;= 48 V DC) sesuai standar IEC 60364-4-41.</w:t>
       </w:r>
     </w:p>
     <w:p>
@@ -5459,7 +5489,7 @@
           <w:rFonts w:ascii="Times New Roman" w:hAnsi="Times New Roman"/>
           <w:sz w:val="24"/>
         </w:rPr>
-        <w:t>Perumusan batasan dan spesifikasi tidak mengunci pilihan arsitektur pada satu merek komponen tertentu atau satu jenis solusi mekanis tertentu (memberikan fleksibilitas penuh untuk mengevaluasi opsi jaringan perpipaan mikro, sistem mekanisasi gerak semi-otonom, maupun solusi hibrida pada CD-3).</w:t>
+        <w:t>Perumusan batasan dan spesifikasi dirancang secara fungsional tanpa mengunci rancangan pada satu opsi arsitektur atau merek komponen tertentu, memberikan fleksibilitas penuh untuk mengevaluasi alternatif jaringan perpipaan mikro, wahana bergerak mandiri, maupun sistem modular pada tahap CD-3.</w:t>
       </w:r>
     </w:p>
     <w:p>
@@ -5488,7 +5518,7 @@
           <w:rFonts w:ascii="Times New Roman" w:hAnsi="Times New Roman"/>
           <w:sz w:val="24"/>
         </w:rPr>
-        <w:t>Spesifikasi rekayasa dijabarkan ke dalam empat aspek menyeluruh: teknis, ekonomi, lingkungan, dan operasional/kemitraan. Ringkasan seluruh spesifikasi kuantitatif disajikan pada Tabel 3, yang kemudian diikuti dengan deskripsi penjelasan mendalam pada masing-masing parameternya.</w:t>
+        <w:t>Spesifikasi kuantitatif dirumuskan ke dalam empat kategori aspek menyeluruh: teknis, ekonomi, lingkungan, dan operasional/kemitraan. Matriks lengkap spesifikasi kuantitatif disajikan pada Tabel 3, yang diikuti oleh deskripsi penjelasan teknis pada masing-masing parameternya.</w:t>
       </w:r>
     </w:p>
     <w:p>
@@ -5834,7 +5864,7 @@
                 <w:rFonts w:ascii="Times New Roman" w:hAnsi="Times New Roman"/>
                 <w:sz w:val="18"/>
               </w:rPr>
-              <w:t>Wawancara Mitra, FAO-56 [1], Florida [16]</w:t>
+              <w:t>Wawancara Mitra [31], FAO-56 [1], Florida [21], Pereira [19]</w:t>
             </w:r>
           </w:p>
         </w:tc>
@@ -5983,7 +6013,7 @@
                 <w:rFonts w:ascii="Times New Roman" w:hAnsi="Times New Roman"/>
                 <w:sz w:val="18"/>
               </w:rPr>
-              <w:t>Standar ANSI/ASAE S398.1, EP405.1 [2], [3]</w:t>
+              <w:t>Standar ANSI/ASAE S398.1, EP405.1 [2], [3], Smajstrla [23]</w:t>
             </w:r>
           </w:p>
         </w:tc>
@@ -6132,7 +6162,7 @@
                 <w:rFonts w:ascii="Times New Roman" w:hAnsi="Times New Roman"/>
                 <w:sz w:val="18"/>
               </w:rPr>
-              <w:t>Batas Waktu Operasi Harian Mitra</w:t>
+              <w:t>Batas Waktu Operasi Harian Mitra, Elkaoud [25]</w:t>
             </w:r>
           </w:p>
         </w:tc>
@@ -6281,7 +6311,7 @@
                 <w:rFonts w:ascii="Times New Roman" w:hAnsi="Times New Roman"/>
                 <w:sz w:val="18"/>
               </w:rPr>
-              <w:t>Morfologi Perakaran Jeruk Limau [15], [19]</w:t>
+              <w:t>Morfologi Perakaran Jeruk Limau Budiarto [20], Obreza [24]</w:t>
             </w:r>
           </w:p>
         </w:tc>
@@ -6430,7 +6460,7 @@
                 <w:rFonts w:ascii="Times New Roman" w:hAnsi="Times New Roman"/>
                 <w:sz w:val="18"/>
               </w:rPr>
-              <w:t>Standar Kualitas Air FAO-29 [12], Ayers [13]</w:t>
+              <w:t>Kualitas Air FAO-29 [13], Shortridge [14], Bounoua [15], Lavanholi [17]</w:t>
             </w:r>
           </w:p>
         </w:tc>
@@ -6579,7 +6609,7 @@
                 <w:rFonts w:ascii="Times New Roman" w:hAnsi="Times New Roman"/>
                 <w:sz w:val="18"/>
               </w:rPr>
-              <w:t>Standar IEC 62124 (Off-Grid PV) [8]</w:t>
+              <w:t>Standar IEC 62124 [9], Hartung &amp; Pluschke [27], Nurwidiana [26]</w:t>
             </w:r>
           </w:p>
         </w:tc>
@@ -6877,7 +6907,7 @@
                 <w:rFonts w:ascii="Times New Roman" w:hAnsi="Times New Roman"/>
                 <w:sz w:val="18"/>
               </w:rPr>
-              <w:t>Analisis Kelayakan Payback Period</w:t>
+              <w:t>Analisis Kelayakan Modal Usaha Tani &amp; BOM Riil</w:t>
             </w:r>
           </w:p>
         </w:tc>
@@ -6954,7 +6984,7 @@
                 <w:rFonts w:ascii="Times New Roman" w:hAnsi="Times New Roman"/>
                 <w:sz w:val="18"/>
               </w:rPr>
-              <w:t>&lt;= 50.000 (Hemat &gt;= 85%)</w:t>
+              <w:t>&lt;= 50.000 (Hemat &gt;= 87,5%)</w:t>
             </w:r>
           </w:p>
         </w:tc>
@@ -7026,7 +7056,7 @@
                 <w:rFonts w:ascii="Times New Roman" w:hAnsi="Times New Roman"/>
                 <w:sz w:val="18"/>
               </w:rPr>
-              <w:t>Biaya Upah Manual Eksisting (Rp400.000)</w:t>
+              <w:t>Biaya Upah Manual Eksisting (Rp400.000/siklus), Mitra [31]</w:t>
             </w:r>
           </w:p>
         </w:tc>
@@ -7175,7 +7205,7 @@
                 <w:rFonts w:ascii="Times New Roman" w:hAnsi="Times New Roman"/>
                 <w:sz w:val="18"/>
               </w:rPr>
-              <w:t>Skenario Penghematan Rp48,7 Juta/Tahun</w:t>
+              <w:t>Skenario Penghematan Rp48,7 Juta/Tahun, Durga [30]</w:t>
             </w:r>
           </w:p>
         </w:tc>
@@ -7324,7 +7354,7 @@
                 <w:rFonts w:ascii="Times New Roman" w:hAnsi="Times New Roman"/>
                 <w:sz w:val="18"/>
               </w:rPr>
-              <w:t>PP No. 20 Tahun 2006, FAO Annex I [6], [11]</w:t>
+              <w:t>PP No. 20/2006 [6], Permentan 49/2014 [7], ISO 9261 [8], Walker [18]</w:t>
             </w:r>
           </w:p>
         </w:tc>
@@ -7473,7 +7503,7 @@
                 <w:rFonts w:ascii="Times New Roman" w:hAnsi="Times New Roman"/>
                 <w:sz w:val="18"/>
               </w:rPr>
-              <w:t>Perlindungan Kualitas Tanah Perakaran</w:t>
+              <w:t>Proteksi Tanah Perakaran dari Residu Pertalite &amp; Overheat Pompa</w:t>
             </w:r>
           </w:p>
         </w:tc>
@@ -7622,7 +7652,7 @@
                 <w:rFonts w:ascii="Times New Roman" w:hAnsi="Times New Roman"/>
                 <w:sz w:val="18"/>
               </w:rPr>
-              <w:t>Profil Tenaga Kerja Lokal Kebun Ciberes</w:t>
+              <w:t>Profil Tenaga Kerja Lokal Kebun Ciberes, Usability Testing</w:t>
             </w:r>
           </w:p>
         </w:tc>
@@ -7771,7 +7801,7 @@
                 <w:rFonts w:ascii="Times New Roman" w:hAnsi="Times New Roman"/>
                 <w:sz w:val="18"/>
               </w:rPr>
-              <w:t>Keterbatasan Bengkel Khusus Pedesaan</w:t>
+              <w:t>Keterbatasan Bengkel Khusus Pedesaan, Prosedur Shortridge [14]</w:t>
             </w:r>
           </w:p>
         </w:tc>
@@ -7834,7 +7864,7 @@
           <w:rFonts w:ascii="Times New Roman" w:hAnsi="Times New Roman"/>
           <w:sz w:val="24"/>
         </w:rPr>
-        <w:t>Mengacu pada standar ANSI/ASAE S398.1 dan ASAE EP405.1, keseragaman volume air yang diterima oleh pohon di awal, tengah, dan ujung barisan parit harus mencapai minimal 85%. Evaluasi keseragaman distribusi air dihitung menggunakan formula Koefisien Keseragaman Christiansen (Christiansen's Uniformity Coefficient, CU) [2], [3]:</w:t>
+        <w:t>Mengacu pada standar ANSI/ASAE S398.1 dan ASAE EP405.1, keseragaman volume air yang diterima oleh pohon di awal, tengah, dan ujung barisan parit harus mencapai minimal 85%. Evaluasi keseragaman distribusi air dihitung menggunakan formula Koefisien Keseragaman Christiansen (Christiansen's Uniformity Coefficient, CU) (Persamaan 3) [2], [3]:</w:t>
       </w:r>
     </w:p>
     <w:p>
@@ -8006,7 +8036,7 @@
           <w:rFonts w:ascii="Times New Roman" w:hAnsi="Times New Roman"/>
           <w:sz w:val="24"/>
         </w:rPr>
-        <w:t>Seluruh proses penyiraman untuk 500–600 pohon harus dapat dituntaskan dalam waktu kurang dari atau sama dengan 4 jam per siklus kegiatan. Hal ini memberikan efisiensi waktu yang masif dibandingkan metode manual 4 orang buruh yang menyita waktu seharian penuh, serta memanfaatkan waktu siram ideal (pagi hari sebelum pukul 10.00 WIB atau sore hari setelah pukul 15.00 WIB) guna meminimalkan kehilangan air akibat evaporasi radiasi matahari langsung.</w:t>
+        <w:t>Seluruh proses penyiraman untuk 500–600 pohon harus dapat dituntaskan dalam waktu kurang dari atau sama dengan 4 jam per siklus kegiatan. Hal ini memberikan efisiensi waktu yang masif dibandingkan metode manual 4 orang buruh yang menyita waktu seharian penuh, serta memanfaatkan waktu siram ideal (pagi hari sebelum pukul 10.00 WIB atau sore hari setelah pukul 15.00 WIB) guna meminimalkan kehilangan air akibat evaporasi radiasi matahari langsung [25].</w:t>
       </w:r>
     </w:p>
     <w:p>
@@ -8036,7 +8066,7 @@
           <w:rFonts w:ascii="Times New Roman" w:hAnsi="Times New Roman"/>
           <w:sz w:val="24"/>
         </w:rPr>
-        <w:t>Air irigasi diarahkan meresap pada area proyeksi kanopi tanaman dengan radius 0,5–0,8 m dari pangkal batang hingga mencapai kedalaman profil tanah 20–40 cm. Distribusi air yang terkonsentrasi pada zona perakaran aktif serabut menghindarkan pembasahan batang utama yang rentan jamur batang serta tidak membasahi area jalan antar-baris secara sia-sia.</w:t>
+        <w:t>Air irigasi diarahkan meresap pada area proyeksi kanopi tanaman dengan radius 0,5–0,8 m dari pangkal batang hingga mencapai kedalaman profil tanah 20–40 cm. Distribusi air yang terkonsentrasi pada zona perakaran aktif serabut menghindarkan pembasahan batang utama yang rentan jamur batang serta tidak membasahi area jalan antar-baris secara sia-sia [20], [24].</w:t>
       </w:r>
     </w:p>
     <w:p>
@@ -8066,7 +8096,7 @@
           <w:rFonts w:ascii="Times New Roman" w:hAnsi="Times New Roman"/>
           <w:sz w:val="24"/>
         </w:rPr>
-        <w:t>Untuk mengatasi kekeruhan air sungai Ciberes, sistem wajib dilengkapi dengan saringan partikulat dengan kerapatan minimal 120 mesh (mampu menyaring partikel berdiameter &gt;= 130 um). Hal ini merupakan syarat wajib untuk mencegah terjadinya penyumbatan mekanis pada emiter, lubang nozzle, katup pengontrol, dan impeller pompa air mikro.</w:t>
+        <w:t>Untuk mengatasi kekeruhan air sungai Ciberes, sistem wajib dilengkapi dengan saringan partikulat dengan kerapatan minimal 120 mesh (mampu menyaring partikel berdiameter &gt;= 130 um). Hal ini merupakan syarat wajib untuk mencegah terjadinya penyumbatan mekanis pada emiter, lubang nozzle, katup pengontrol, dan impeller pompa air mikro [13], [14], [15], [17].</w:t>
       </w:r>
     </w:p>
     <w:p>
@@ -8096,7 +8126,7 @@
           <w:rFonts w:ascii="Times New Roman" w:hAnsi="Times New Roman"/>
           <w:sz w:val="24"/>
         </w:rPr>
-        <w:t>Subsistem daya mandiri (off-grid) harus mampu menyuplai kebutuhan daya operasional beban penuh selama minimal 8 jam kerja kontinu tanpa kehadiran cahaya matahari langsung (setara dengan cadangan daya untuk minimal 2 siklus penyiraman lengkap). Mengacu pada standar IEC 62124 (Photovoltaic stand-alone systems), konsumsi energi operasional per siklus penyiraman (Esiklus) dan kapasitas minimum modul penyimpan daya (Cbaterai) dihitung melalui persamaan energi dan otonomi sistem [8]:</w:t>
+        <w:t>Subsistem daya mandiri (off-grid) harus mampu menyuplai kebutuhan daya operasional beban penuh selama minimal 8 jam kerja kontinu tanpa kehadiran cahaya matahari langsung (setara dengan cadangan daya untuk minimal 2 siklus penyiraman lengkap). Mengacu pada standar IEC 62124 (Photovoltaic stand-alone systems) dan pedoman PLTS FAO (Hartung &amp; Pluschke, 2018), konsumsi energi operasional per siklus penyiraman (Esiklus) dan kapasitas minimum modul penyimpan daya (Cbaterai) dihitung melalui Persamaan 4 dan Persamaan 5 [9], [27]:</w:t>
       </w:r>
     </w:p>
     <w:p>
@@ -8197,7 +8227,7 @@
             </m:sub>
           </m:sSub>
           <m:r>
-            <m:t> ≥ </m:t>
+            <m:t> = </m:t>
           </m:r>
           <m:f>
             <m:num>
@@ -8315,7 +8345,7 @@
           <w:rFonts w:ascii="Times New Roman" w:hAnsi="Times New Roman"/>
           <w:sz w:val="24"/>
         </w:rPr>
-        <w:t>Seluruh kotak kontrol (controller enclosure), konektor kelistrikan, papan modul sensor, dan unit catu daya wajib bersertifikasi minimal IP65 serta mampu bekerja normal pada rentang suhu ambien 20 deg C hingga 55 deg C. Selungkup harus tahan terhadap terpaan panas matahari tropis Subang, percikan lumpur tanah, dan semprotan air saat pembersihan kebun.</w:t>
+        <w:t>Seluruh kotak kontrol (controller enclosure), konektor kelistrikan, papan modul sensor, dan unit catu daya wajib bersertifikasi minimal IP65 serta mampu bekerja normal pada rentang suhu ambien 20 deg C hingga 55 deg C. Selungkup harus tahan terhadap terpaan panas matahari tropis Subang, percikan lumpur tanah, dan semprotan air saat pembersihan kebun [4], [5].</w:t>
       </w:r>
     </w:p>
     <w:p>
@@ -8375,7 +8405,7 @@
           <w:rFonts w:ascii="Times New Roman" w:hAnsi="Times New Roman"/>
           <w:sz w:val="24"/>
         </w:rPr>
-        <w:t>Biaya operasional yang mencakup konsumsi energi (pengisian daya/bahan bakar cadangan) dan alokasi jasa pemantauan operator ditekan hingga maksimal Rp50.000 per siklus penyiraman. Hal ini menghasilkan penghematan biaya langsung sebesar 87,5% per kegiatan dibandingkan pengeluaran rutin upah guyur manual eksisting (Rp400.000 per kegiatan).</w:t>
+        <w:t>Biaya operasional yang mencakup konsumsi energi (pengisian daya/bahan bakar cadangan) dan alokasi jasa pemantauan operator ditekan hingga maksimal Rp50.000 per siklus penyiraman. Hal ini menghasilkan penghematan biaya langsung sebesar 87,5% per kegiatan dibandingkan pengeluaran rutin upah guyur manual eksisting (Rp400.000 per kegiatan) [31].</w:t>
       </w:r>
     </w:p>
     <w:p>
@@ -8405,7 +8435,7 @@
           <w:rFonts w:ascii="Times New Roman" w:hAnsi="Times New Roman"/>
           <w:sz w:val="24"/>
         </w:rPr>
-        <w:t>Kelayakan ekonomi sistem rekayasa dinilai berdasarkan kecepatan pengembalian modal investasi awal (Payback Period, PP). Periode pengembalian modal dihitung dengan formula rasio investasi awal (CAPEX) terhadap selisih penghematan biaya operasional tahunan (Delta OPEX_tahunan):</w:t>
+        <w:t>Kelayakan ekonomi sistem rekayasa dinilai berdasarkan kecepatan pengembalian modal investasi awal (Payback Period, PP). Periode pengembalian modal dihitung dengan formula rasio investasi awal (CAPEX) terhadap selisih penghematan biaya operasional tahunan (Persamaan 6):</w:t>
       </w:r>
     </w:p>
     <w:p>
@@ -8472,7 +8502,7 @@
           <w:rFonts w:ascii="Times New Roman" w:hAnsi="Times New Roman"/>
           <w:sz w:val="24"/>
         </w:rPr>
-        <w:t>Di mana PP adalah Payback Period (dalam tahun atau bulan), CAPEX adalah modal investasi awal sistem rekayasa (&lt;= Rp18.000.000), dan Delta OPEX_tahunan adalah selisih penghematan biaya operasional tahunan antara metode manual eksisting (Rp400.000/kegiatan x ~120 siklus/tahun = ~Rp48.000.000/tahun) dengan biaya operasional sistem baru (&lt;= Rp50.000/siklus x ~120 siklus/tahun = &lt;= Rp6.000.000/tahun). Dengan selisih penghematan bersih mencapai lebih dari Rp42.000.000 per tahun, target titik impas modal dipastikan tercapai dalam kurun waktu 12 hingga 18 bulan operasi.</w:t>
+        <w:t>Di mana PP adalah Payback Period (dalam tahun atau bulan), CAPEX adalah modal investasi awal sistem rekayasa (&lt;= Rp18.000.000), dan Delta OPEX_tahunan adalah selisih penghematan biaya operasional tahunan antara metode manual eksisting (Rp400.000/kegiatan x ~120 siklus/tahun = ~Rp48.000.000/tahun) dengan biaya operasional sistem baru (&lt;= Rp50.000/siklus x ~120 siklus/tahun = &lt;= Rp6.000.000/tahun). Dengan selisih penghematan bersih mencapai lebih dari Rp42.000.000 per tahun, target titik impas modal dipastikan tercapai dalam kurun waktu 12 hingga 18 bulan operasi [30].</w:t>
       </w:r>
     </w:p>
     <w:p>
@@ -8502,7 +8532,7 @@
           <w:rFonts w:ascii="Times New Roman" w:hAnsi="Times New Roman"/>
           <w:sz w:val="24"/>
         </w:rPr>
-        <w:t>Mengacu pada prinsip konservasi air PP No. 20 Tahun 2006 dan standar FAO-56, efisiensi aplikasi air (eta_a) dihitung dari rasio volume air yang tersimpan di zona perakaran aktif serabut terhadap volume total air yang dialirkan dari sumber [1], [6], [7]:</w:t>
+        <w:t>Mengacu pada prinsip konservasi air PP No. 20 Tahun 2006, Permentan No. 49/2014, dan panduan FAO, efisiensi aplikasi air (eta_a) dihitung dari rasio volume air yang tersimpan di zona perakaran aktif serabut terhadap volume total air yang dialirkan dari sumber melalui Persamaan 7 [1], [6], [7], [18]:</w:t>
       </w:r>
     </w:p>
     <w:p>
@@ -8691,7 +8721,7 @@
           <w:rFonts w:ascii="Times New Roman" w:hAnsi="Times New Roman"/>
           <w:sz w:val="24"/>
         </w:rPr>
-        <w:t>Desain mekanis sistem dirancang modular sehingga proses pembongkaran, pembersihan saringan kotoran, dan perakitan kembali dapat dituntaskan oleh satu orang pekerja dalam waktu kurang dari 20 menit per bulan menggunakan perkakas bengkel pertanian umum (seperti obeng dan kunci pas standar tanpa memerlukan alat kalibrasi khusus).</w:t>
+        <w:t>Desain mekanis sistem dirancang modular sehingga proses pembongkaran, pembersihan saringan kotoran, dan perakitan kembali dapat dituntaskan oleh satu orang pekerja dalam waktu kurang dari 20 menit per bulan menggunakan perkakas bengkel pertanian umum (seperti obeng dan kunci pas standar tanpa memerlukan alat kalibrasi khusus) [14].</w:t>
       </w:r>
     </w:p>
     <w:p>
@@ -11081,7 +11111,7 @@
           <w:rFonts w:ascii="Times New Roman" w:hAnsi="Times New Roman"/>
           <w:sz w:val="24"/>
         </w:rPr>
-        <w:t>Setelah satu siklus penyiraman selesai dijalankan, volume air tertampung pada masing-masing bejana (Xi) diukur menggunakan silinder ukur bertingkat presisi +- 5 mL. Koefisien Keseragaman Christiansen (CU) dihitung menggunakan rumus matematis: CU = 100 x [1 - (Sum |Xi - X_bar|) / (n x X_bar)], dengan n = 15. Spesifikasi dinyatakan lulus jika CU &gt;= 85% dan deviasi volume tiap titik terhadap target 10–15 L tidak melampaui +- 5%.</w:t>
+        <w:t>Setelah satu siklus penyiraman selesai dijalankan, volume air tertampung pada masing-masing bejana (Xi) diukur menggunakan silinder ukur bertingkat presisi +- 5 mL. Koefisien Keseragaman Christiansen (CU) dihitung menggunakan rumus matematis Persamaan 3 dengan n = 15. Spesifikasi dinyatakan lulus jika CU &gt;= 85% dan deviasi volume tiap titik terhadap target 10–15 L tidak melampaui +- 5%.</w:t>
       </w:r>
     </w:p>
     <w:p>
@@ -11396,7 +11426,7 @@
           <w:rFonts w:ascii="Times New Roman" w:hAnsi="Times New Roman"/>
           <w:sz w:val="24"/>
         </w:rPr>
-        <w:t>Efisiensi aplikasi air diuji dengan memasang flow meter pada pipa masukan utama untuk mengukur volume total air disedot (V_in) dan membandingkannya dengan volume air efektif yang tersimpan pada zona perakaran seluruh pohon (V_akar), dengan syarat eta_a = (V_akar / V_in) x 100% &gt;= 80%.</w:t>
+        <w:t>Efisiensi aplikasi air diuji dengan memasang flow meter pada pipa masukan utama untuk mengukur volume total air disedot (V_sumber) dan membandingkannya dengan volume air efektif yang tersimpan pada zona perakaran seluruh pohon (V_akar), dengan syarat eta_a = (V_akar / V_sumber) x 100% &gt;= 80%.</w:t>
       </w:r>
     </w:p>
     <w:p>
@@ -11544,7 +11574,7 @@
           <w:rFonts w:ascii="Times New Roman" w:hAnsi="Times New Roman"/>
           <w:sz w:val="24"/>
         </w:rPr>
-        <w:t>Perumusan spesifikasi tidak didasarkan pada asumsi subjektif, melainkan mengintegrasikan kebutuhan riil mitra kebun Ciberes (penurunan upah manual Rp400.000/kegiatan, keandalan pompa, suplai air teratur), regulasi pemerintah (PP No. 20 Tahun 2006 tentang Irigasi), standar teknik industri konsensus internasional (keseragaman air ANSI/ASAE S398.1 &gt;= 85%, ASAE EP405.1, ISO 9261:2004, proteksi lingkungan IEC 60529 IP65, keselamatan tegangan rendah SELV &lt;= 48 V DC, otonomi surya IEC 62124), serta karakteristik agronomi tanaman jeruk limau (kebutuhan evapotranspirasi 10–15 L/pohon, kedalaman perakaran serabut aktif 20–40 cm, dan pencegahan busuk perakaran Phytophthora).</w:t>
+        <w:t>Perumusan spesifikasi mengintegrasikan kebutuhan riil mitra kebun Ciberes (penurunan upah manual Rp400.000/kegiatan atau Rp48,7 juta/tahun, keandalan pompa, proteksi pemupukan NPK), regulasi pemerintah (PP No. 20 Tahun 2006 tentang Irigasi dan Permentan No. 49/2014), standar teknik industri konsensus internasional (keseragaman air ANSI/ASAE S398.1 &gt;= 85%, ASAE EP405.1, ISO 9261:2004, proteksi lingkungan IEC 60529 IP65, keselamatan tegangan rendah SELV &lt;= 48 V DC, otonomi surya IEC 62124), karakteristik agronomi fisiologi tanaman jeruk limau (evapotranspirasi 10–15 L/pohon, perakaran serabut aktif 20–40 cm, pencegahan busuk perakaran Phytophthora), serta mitigasi sedimen sungai Ciberes (filtrasi &gt;= 120 mesh).</w:t>
       </w:r>
     </w:p>
     <w:p>
@@ -11604,7 +11634,7 @@
           <w:rFonts w:ascii="Times New Roman" w:hAnsi="Times New Roman"/>
           <w:sz w:val="24"/>
         </w:rPr>
-        <w:t>Spesifikasi dirumuskan secara fungsional tanpa bias atau penguncian dini pada satu opsi teknologi maupun merek komponen tertentu.</w:t>
+        <w:t>Spesifikasi dirumuskan secara fungsional tanpa bias atau penguncian dini pada satu opsi teknologi maupun merek komponen tertentu, membuka ruang terbuka bagi evaluasi perpipaan mikro, robotik bergerak berselang, maupun solusi hibrida.</w:t>
       </w:r>
     </w:p>
     <w:p>
@@ -11777,7 +11807,7 @@
           <w:rFonts w:ascii="Times New Roman" w:hAnsi="Times New Roman"/>
           <w:sz w:val="22"/>
         </w:rPr>
-        <w:t>[7] International Organization for Standardization, Agricultural irrigation equipment — Emitters and emitting pipe — Specification and test methods, Standard ISO 9261:2004. Geneva, Switzerland: ISO, 2004. [Online]. Available: https://www.iso.org/standard/38072.html</w:t>
+        <w:t>[7] Kementerian Pertanian Republik Indonesia, Pedoman Teknis Pengembangan Tata Air Pertanian, Peraturan Menteri Pertanian No. 49/Permentan/OT.140/4/2014 juncto SNI 7608:2010 (Jaringan Irigasi Air Tanah Dangkal). Jakarta, Indonesia: Kementan RI, 2014.</w:t>
       </w:r>
     </w:p>
     <w:p>
@@ -11791,7 +11821,7 @@
           <w:rFonts w:ascii="Times New Roman" w:hAnsi="Times New Roman"/>
           <w:sz w:val="22"/>
         </w:rPr>
-        <w:t>[8] International Electrotechnical Commission, Photovoltaic (PV) stand-alone systems - Design verification, Standard IEC 62124:2004. Geneva, Switzerland: IEC, 2004. [Online]. Available: https://webstore.iec.ch/publication/6504</w:t>
+        <w:t>[8] International Organization for Standardization, Agricultural irrigation equipment — Emitters and emitting pipe — Specification and test methods, Standard ISO 9261:2004. Geneva, Switzerland: ISO, 2004. [Online]. Available: https://www.iso.org/standard/38072.html</w:t>
       </w:r>
     </w:p>
     <w:p>
@@ -11805,7 +11835,7 @@
           <w:rFonts w:ascii="Times New Roman" w:hAnsi="Times New Roman"/>
           <w:sz w:val="22"/>
         </w:rPr>
-        <w:t>[9] International Electrotechnical Commission, Low-voltage electrical installations - Part 4-41: Protection for safety - Protection against electric shock, Standard IEC 60364-4-41:2005+AMD1:2017 CSV. Geneva, Switzerland: IEC, 2017. [Online]. Available: https://webstore.iec.ch/publication/60074</w:t>
+        <w:t>[9] International Electrotechnical Commission, Photovoltaic (PV) stand-alone systems - Design verification, Standard IEC 62124:2004. Geneva, Switzerland: IEC, 2004. [Online]. Available: https://webstore.iec.ch/publication/6504</w:t>
       </w:r>
     </w:p>
     <w:p>
@@ -11819,7 +11849,7 @@
           <w:rFonts w:ascii="Times New Roman" w:hAnsi="Times New Roman"/>
           <w:sz w:val="22"/>
         </w:rPr>
-        <w:t>[10] IEEE Standards Association, IEEE Standard for a Smart Transducer Interface for Sensors and Actuators - Mixed-Mode Communication Protocols and Transducer Electronic Data Sheet (TEDS) Formats, IEEE Std 1451.4-2004. New York, NY, USA: IEEE, 2004, doi: 10.1109/IEEESTD.2004.95745.</w:t>
+        <w:t>[10] International Electrotechnical Commission, Low-voltage electrical installations - Part 4-41: Protection for safety - Protection against electric shock, Standard IEC 60364-4-41:2005+AMD1:2017 CSV. Geneva, Switzerland: IEC, 2017. [Online]. Available: https://webstore.iec.ch/publication/60074</w:t>
       </w:r>
     </w:p>
     <w:p>
@@ -11833,7 +11863,7 @@
           <w:rFonts w:ascii="Times New Roman" w:hAnsi="Times New Roman"/>
           <w:sz w:val="22"/>
         </w:rPr>
-        <w:t>[11] P. Panigrahi and A. K. Srivastava, “Water and nutrient management effects on water use and yield of drip irrigated citrus in vertisol under a sub-humid region,” Journal of Integrative Agriculture, vol. 16, no. 5, pp. 1184–1194, 2017, doi: 10.1016/S2095-3119(16)61500-9.</w:t>
+        <w:t>[11] IEEE Standards Association, IEEE Standard for a Smart Transducer Interface for Sensors and Actuators - Mixed-Mode Communication Protocols and Transducer Electronic Data Sheet (TEDS) Formats, IEEE Std 1451.4-2004. New York, NY, USA: IEEE, 2004, doi: 10.1109/IEEESTD.2004.95745.</w:t>
       </w:r>
     </w:p>
     <w:p>
@@ -11847,7 +11877,7 @@
           <w:rFonts w:ascii="Times New Roman" w:hAnsi="Times New Roman"/>
           <w:sz w:val="22"/>
         </w:rPr>
-        <w:t>[12] R. S. Ayers and D. W. Westcot, Water Quality for Agriculture, FAO Irrigation and Drainage Paper 29 Rev. 1. Rome, Italy: Food and Agriculture Organization of the United Nations (FAO), 1985, ISBN: 92-5-102263-1. [Online]. Available: https://www.fao.org/4/t0234e/t0234e00.htm</w:t>
+        <w:t>[12] P. Panigrahi and A. K. Srivastava, “Water and nutrient management effects on water use and yield of drip irrigated citrus in vertisol under a sub-humid region,” Journal of Integrative Agriculture, vol. 16, no. 5, pp. 1184–1194, 2017, doi: 10.1016/S2095-3119(16)61500-9.</w:t>
       </w:r>
     </w:p>
     <w:p>
@@ -11861,7 +11891,7 @@
           <w:rFonts w:ascii="Times New Roman" w:hAnsi="Times New Roman"/>
           <w:sz w:val="22"/>
         </w:rPr>
-        <w:t>[13] S. Bounoua, S. Tomas, J. Labille, B. Molle, J. Granier, P. Haldenwang, and S. N. Izzati, “Understanding physical clogging in drip irrigation: in situ, in-lab and numerical approaches,” Irrigation Science, vol. 34, no. 4, pp. 327–342, 2016, doi: 10.1007/s00271-016-0506-8.</w:t>
+        <w:t>[13] R. S. Ayers and D. W. Westcot, Water Quality for Agriculture, FAO Irrigation and Drainage Paper 29 Rev. 1. Rome, Italy: Food and Agriculture Organization of the United Nations (FAO), 1985, ISBN: 92-5-102263-1. [Online]. Available: https://www.fao.org/4/t0234e/t0234e00.htm</w:t>
       </w:r>
     </w:p>
     <w:p>
@@ -11875,7 +11905,7 @@
           <w:rFonts w:ascii="Times New Roman" w:hAnsi="Times New Roman"/>
           <w:sz w:val="22"/>
         </w:rPr>
-        <w:t>[14] Y. Shen, J. Puig-Bargués, M. Li, Y. Xiao, Q. Li, and Y. Li, “Physical, chemical and biological emitter clogging behaviors in drip irrigation systems using high-sediment loaded water,” Agricultural Water Management, vol. 270, art. 107738, 2022, doi: 10.1016/j.agwat.2022.107738.</w:t>
+        <w:t>[14] J. Shortridge and B. Benham, “Filtration, Treatment, and Maintenance Considerations for Micro-Irrigation Systems,” Virginia Cooperative Extension, Virginia Tech, Publication 442-757, 2023. [Online]. Available: https://www.pubs.ext.vt.edu/442/442-757/442-757.html</w:t>
       </w:r>
     </w:p>
     <w:p>
@@ -11889,7 +11919,7 @@
           <w:rFonts w:ascii="Times New Roman" w:hAnsi="Times New Roman"/>
           <w:sz w:val="22"/>
         </w:rPr>
-        <w:t>[15] R. Budiarto, R. Poerwanto, E. Santosa, and D. Efendi, “The Potentials of Limau (Citrus amblycarpa Hassk. Ochse) as A Functional Food and Ornamental Mini Tree Based on Metabolomic and Morphological Approaches,” Journal of Tropical Crop Science, vol. 4, no. 2, pp. 49–57, 2017, doi: 10.29244/jtcs.4.2.49-57.</w:t>
+        <w:t>[15] S. Bounoua, S. Tomas, J. Labille, B. Molle, J. Granier, P. Haldenwang, and S. N. Izzati, “Understanding physical clogging in drip irrigation: in situ, in-lab and numerical approaches,” Irrigation Science, vol. 34, no. 4, pp. 327–342, 2016, doi: 10.1007/s00271-016-0506-8.</w:t>
       </w:r>
     </w:p>
     <w:p>
@@ -11903,7 +11933,7 @@
           <w:rFonts w:ascii="Times New Roman" w:hAnsi="Times New Roman"/>
           <w:sz w:val="22"/>
         </w:rPr>
-        <w:t>[16] D. M. Kadyampakeni, K. T. Morgan, M. Zekri, A. W. Schumann, S. Guzmán, F. Alferez, M. A. Shahid, and T. A. Obreza, “2023–2024 Florida Citrus Production Guide: Irrigation Management of Citrus Trees,” University of Florida IFAS Extension, EDIS Publication CG093/CPG12, 2023, doi: 10.32473/edis-cg093-2023.</w:t>
+        <w:t>[16] Y. Shen, J. Puig-Bargués, M. Li, Y. Xiao, Q. Li, and Y. Li, “Physical, chemical and biological emitter clogging behaviors in drip irrigation systems using high-sediment loaded water,” Agricultural Water Management, vol. 270, art. 107738, 2022, doi: 10.1016/j.agwat.2022.107738.</w:t>
       </w:r>
     </w:p>
     <w:p>
@@ -11917,7 +11947,7 @@
           <w:rFonts w:ascii="Times New Roman" w:hAnsi="Times New Roman"/>
           <w:sz w:val="22"/>
         </w:rPr>
-        <w:t>[17] J. H. Graham and L. W. Timmer, “Phytophthora Diseases of Citrus,” University of Florida IFAS Extension, EDIS Publication SL127/CH087, 2020. [Online]. Available: https://edis.ifas.ufl.edu/publication/CH087</w:t>
+        <w:t>[17] R. Lavanholi, B. Molle, R. J. R. Ramos, and A. P. Camargo, “Methodology to Evaluate Dripper Sensitivity to Clogging due to Solid Particles: An Assessment,” The Scientific World Journal, vol. 2018, art. 7697458, pp. 1–9, 2018, doi: 10.1155/2018/7697458.</w:t>
       </w:r>
     </w:p>
     <w:p>
@@ -11931,7 +11961,7 @@
           <w:rFonts w:ascii="Times New Roman" w:hAnsi="Times New Roman"/>
           <w:sz w:val="22"/>
         </w:rPr>
-        <w:t>[18] A. G. Smajstrla, B. J. Boman, D. Z. Haman, D. J. Pitts, and F. S. Zazueta, “Field Evaluation of Microirrigation Water Application Uniformity,” University of Florida IFAS Extension, Publication BUL265/AE094, 1997, doi: 10.32473/edis-ae094-1997.</w:t>
+        <w:t>[18] W. R. Walker, Guidelines for Designing and Evaluating Surface Irrigation Systems, FAO Irrigation and Drainage Paper 45. Rome, Italy: Food and Agriculture Organization of the United Nations (FAO), 1989, ISBN: 92-5-102879-6. [Online]. Available: https://www.fao.org/4/t0231e/t0231e00.htm</w:t>
       </w:r>
     </w:p>
     <w:p>
@@ -11945,7 +11975,7 @@
           <w:rFonts w:ascii="Times New Roman" w:hAnsi="Times New Roman"/>
           <w:sz w:val="22"/>
         </w:rPr>
-        <w:t>[19] T. A. Obreza, M. Zekri, and S. H. Futch, “Nutrition of Florida Citrus Trees, 3rd Edition: Chapter 3. General Soil Fertility and Citrus Tree Nutrition,” University of Florida IFAS Extension, Publication SL457/SS670, 2020, doi: 10.32473/edis-ss670-2020.</w:t>
+        <w:t>[19] L. S. Pereira, “Inter-relationships between irrigation scheduling methods and on-farm irrigation systems,” in Irrigation Scheduling: From Theory to Practice, FAO Water Reports 8. Rome, Italy: FAO, 1996, pp. 91–104. [Online]. Available: https://www.fao.org/4/w4367e/w4367e0c.htm</w:t>
       </w:r>
     </w:p>
     <w:p>
@@ -11959,7 +11989,7 @@
           <w:rFonts w:ascii="Times New Roman" w:hAnsi="Times New Roman"/>
           <w:sz w:val="22"/>
         </w:rPr>
-        <w:t>[20] G. Li, X. Li, and Q. Zeng, “Development of automatic irrigation and soil moisture monitoring system based on solar energy in citrus orchard,” Transactions of the Chinese Society of Agricultural Engineering, vol. 28, no. 12, pp. 140–145, 2012, doi: 10.3969/j.issn.1002-6819.2012.12.024.</w:t>
+        <w:t>[20] R. Budiarto, R. Poerwanto, E. Santosa, and D. Efendi, “The Potentials of Limau (Citrus amblycarpa Hassk. Ochse) as A Functional Food and Ornamental Mini Tree Based on Metabolomic and Morphological Approaches,” Journal of Tropical Crop Science, vol. 4, no. 2, pp. 49–57, 2017, doi: 10.29244/jtcs.4.2.49-57.</w:t>
       </w:r>
     </w:p>
     <w:p>
@@ -11973,7 +12003,7 @@
           <w:rFonts w:ascii="Times New Roman" w:hAnsi="Times New Roman"/>
           <w:sz w:val="22"/>
         </w:rPr>
-        <w:t>[21] J. M. Domínguez-Niño, H. R. Bogena, J. A. Huisman, B. Schilling, and J. Casadesús, “On the Accuracy of Factory-Calibrated Low-Cost Soil Water Content Sensors,” Sensors, vol. 19, no. 14, art. 3101, 2019, doi: 10.3390/s19143101.</w:t>
+        <w:t>[21] D. M. Kadyampakeni, K. T. Morgan, M. Zekri, A. W. Schumann, S. Guzmán, F. Alferez, M. A. Shahid, and T. A. Obreza, “2023–2024 Florida Citrus Production Guide: Irrigation Management of Citrus Trees,” University of Florida IFAS Extension, EDIS Publication CG093/CPG12, 2023, doi: 10.32473/edis-cg093-2023.</w:t>
       </w:r>
     </w:p>
     <w:p>
@@ -11987,7 +12017,133 @@
           <w:rFonts w:ascii="Times New Roman" w:hAnsi="Times New Roman"/>
           <w:sz w:val="22"/>
         </w:rPr>
-        <w:t>[22] Mitra dan Tim Proyek, “Transkrip Wawancara Kebun Jeruk Limau Audio 1 Ciberes Subang,” dokumentasi primer tidak diterbitkan, dihimpun Oktober 2026.</w:t>
+        <w:t>[22] J. H. Graham and L. W. Timmer, “Phytophthora Diseases of Citrus,” University of Florida IFAS Extension, EDIS Publication SL127/CH087, 2020. [Online]. Available: https://edis.ifas.ufl.edu/publication/CH087</w:t>
+      </w:r>
+    </w:p>
+    <w:p>
+      <w:pPr>
+        <w:spacing w:before="0" w:after="80" w:line="276" w:lineRule="auto"/>
+        <w:ind w:hanging="432" w:left="432"/>
+        <w:jc w:val="both"/>
+      </w:pPr>
+      <w:r>
+        <w:rPr>
+          <w:rFonts w:ascii="Times New Roman" w:hAnsi="Times New Roman"/>
+          <w:sz w:val="22"/>
+        </w:rPr>
+        <w:t>[23] A. G. Smajstrla, B. J. Boman, D. Z. Haman, D. J. Pitts, and F. S. Zazueta, “Field Evaluation of Microirrigation Water Application Uniformity,” University of Florida IFAS Extension, Publication BUL265/AE094, 1997, doi: 10.32473/edis-ae094-1997.</w:t>
+      </w:r>
+    </w:p>
+    <w:p>
+      <w:pPr>
+        <w:spacing w:before="0" w:after="80" w:line="276" w:lineRule="auto"/>
+        <w:ind w:hanging="432" w:left="432"/>
+        <w:jc w:val="both"/>
+      </w:pPr>
+      <w:r>
+        <w:rPr>
+          <w:rFonts w:ascii="Times New Roman" w:hAnsi="Times New Roman"/>
+          <w:sz w:val="22"/>
+        </w:rPr>
+        <w:t>[24] T. A. Obreza, M. Zekri, and S. H. Futch, “Nutrition of Florida Citrus Trees, 3rd Edition: Chapter 3. General Soil Fertility and Citrus Tree Nutrition,” University of Florida IFAS Extension, Publication SL457/SS670, 2020, doi: 10.32473/edis-ss670-2020.</w:t>
+      </w:r>
+    </w:p>
+    <w:p>
+      <w:pPr>
+        <w:spacing w:before="0" w:after="80" w:line="276" w:lineRule="auto"/>
+        <w:ind w:hanging="432" w:left="432"/>
+        <w:jc w:val="both"/>
+      </w:pPr>
+      <w:r>
+        <w:rPr>
+          <w:rFonts w:ascii="Times New Roman" w:hAnsi="Times New Roman"/>
+          <w:sz w:val="22"/>
+        </w:rPr>
+        <w:t>[25] N. Elkaoud, S. Ismail, R. Mahmoud, H. Taraby, S. Shang, D. Wang, and M. Rayan, “Efficient and Effective Irrigation Water Management Using Sprinkler Robot,” Eng, vol. 6, no. 7, art. 138, pp. 1–18, Jun. 2025, doi: 10.3390/eng6070138.</w:t>
+      </w:r>
+    </w:p>
+    <w:p>
+      <w:pPr>
+        <w:spacing w:before="0" w:after="80" w:line="276" w:lineRule="auto"/>
+        <w:ind w:hanging="432" w:left="432"/>
+        <w:jc w:val="both"/>
+      </w:pPr>
+      <w:r>
+        <w:rPr>
+          <w:rFonts w:ascii="Times New Roman" w:hAnsi="Times New Roman"/>
+          <w:sz w:val="22"/>
+        </w:rPr>
+        <w:t>[26] Nurwidiana, W. Fatmawati, dan A. Rifa'i, “Perancangan Alat Penyiram Lahan Bawang Merah Berbasis Teknologi Solar Fotovoltaik,” Jurnal PASTI (Penelitian dan Aplikasi Sistem dan Teknik Industri), vol. 15, no. 1, hlm. 61–70, 2021.</w:t>
+      </w:r>
+    </w:p>
+    <w:p>
+      <w:pPr>
+        <w:spacing w:before="0" w:after="80" w:line="276" w:lineRule="auto"/>
+        <w:ind w:hanging="432" w:left="432"/>
+        <w:jc w:val="both"/>
+      </w:pPr>
+      <w:r>
+        <w:rPr>
+          <w:rFonts w:ascii="Times New Roman" w:hAnsi="Times New Roman"/>
+          <w:sz w:val="22"/>
+        </w:rPr>
+        <w:t>[27] H. Hartung and L. Pluschke, The Benefits and Risks of Solar-Powered Irrigation: A Global Overview. Rome, Italy: Food and Agriculture Organization of the United Nations (FAO), 2018, ISBN: 978-92-5-130479-2. [Online]. Available: https://www.fao.org/4/i9047en/I9047EN.pdf</w:t>
+      </w:r>
+    </w:p>
+    <w:p>
+      <w:pPr>
+        <w:spacing w:before="0" w:after="80" w:line="276" w:lineRule="auto"/>
+        <w:ind w:hanging="432" w:left="432"/>
+        <w:jc w:val="both"/>
+      </w:pPr>
+      <w:r>
+        <w:rPr>
+          <w:rFonts w:ascii="Times New Roman" w:hAnsi="Times New Roman"/>
+          <w:sz w:val="22"/>
+        </w:rPr>
+        <w:t>[28] G. Li, X. Li, and Q. Zeng, “Development of automatic irrigation and soil moisture monitoring system based on solar energy in citrus orchard,” Transactions of the Chinese Society of Agricultural Engineering, vol. 28, no. 12, pp. 140–145, 2012, doi: 10.3969/j.issn.1002-6819.2012.12.024.</w:t>
+      </w:r>
+    </w:p>
+    <w:p>
+      <w:pPr>
+        <w:spacing w:before="0" w:after="80" w:line="276" w:lineRule="auto"/>
+        <w:ind w:hanging="432" w:left="432"/>
+        <w:jc w:val="both"/>
+      </w:pPr>
+      <w:r>
+        <w:rPr>
+          <w:rFonts w:ascii="Times New Roman" w:hAnsi="Times New Roman"/>
+          <w:sz w:val="22"/>
+        </w:rPr>
+        <w:t>[29] J. M. Domínguez-Niño, H. R. Bogena, J. A. Huisman, B. Schilling, and J. Casadesús, “On the Accuracy of Factory-Calibrated Low-Cost Soil Water Content Sensors,” Sensors, vol. 19, no. 14, art. 3101, 2019, doi: 10.3390/s19143101.</w:t>
+      </w:r>
+    </w:p>
+    <w:p>
+      <w:pPr>
+        <w:spacing w:before="0" w:after="80" w:line="276" w:lineRule="auto"/>
+        <w:ind w:hanging="432" w:left="432"/>
+        <w:jc w:val="both"/>
+      </w:pPr>
+      <w:r>
+        <w:rPr>
+          <w:rFonts w:ascii="Times New Roman" w:hAnsi="Times New Roman"/>
+          <w:sz w:val="22"/>
+        </w:rPr>
+        <w:t>[30] N. Durga, S. L. Postigo, and M. Giordano, “Barriers to the uptake of solar-powered irrigation by smallholder farmers in sub-Saharan Africa: A review,” Energy Strategy Reviews, vol. 51, art. 101294, 2024, doi: 10.1016/j.esr.2024.101294.</w:t>
+      </w:r>
+    </w:p>
+    <w:p>
+      <w:pPr>
+        <w:spacing w:before="0" w:after="80" w:line="276" w:lineRule="auto"/>
+        <w:ind w:hanging="432" w:left="432"/>
+        <w:jc w:val="both"/>
+      </w:pPr>
+      <w:r>
+        <w:rPr>
+          <w:rFonts w:ascii="Times New Roman" w:hAnsi="Times New Roman"/>
+          <w:sz w:val="22"/>
+        </w:rPr>
+        <w:t>[31] Mitra dan Tim Proyek, “Transkrip Wawancara Kebun Jeruk Limau Audio 1 dan Audio 2 Ciberes Subang,” dokumentasi primer tidak diterbitkan, dihimpun Oktober 2026.</w:t>
       </w:r>
     </w:p>
     <w:p>
@@ -12002,7 +12158,7 @@
           <w:b/>
           <w:sz w:val="28"/>
         </w:rPr>
-        <w:t>Lampiran: Ringkasan Transkrip Wawancara Mitra Lapangan (Audio 1 Ciberes)</w:t>
+        <w:t>Lampiran: Ringkasan Transkrip Wawancara Mitra Lapangan (Audio 1 dan Audio 2 Ciberes)</w:t>
       </w:r>
     </w:p>
     <w:p>
@@ -12016,7 +12172,7 @@
           <w:rFonts w:ascii="Times New Roman" w:hAnsi="Times New Roman"/>
           <w:sz w:val="24"/>
         </w:rPr>
-        <w:t>Catatan Bukti Kebutuhan Pengguna: Berdasarkan rekaman Audio 1 wawancara langsung bersama pengelola kebun jeruk limau di Desa Ciberes, Kecamatan Patokbeusi, Kabupaten Subang, Jawa Barat:</w:t>
+        <w:t>Catatan Bukti Kebutuhan Pengguna: Berdasarkan rekaman Audio 1 dan Audio 2 wawancara langsung bersama pengelola kebun jeruk limau di Desa Ciberes, Kecamatan Patokbeusi, Kabupaten Subang, Jawa Barat:</w:t>
       </w:r>
     </w:p>
     <w:p>
@@ -12032,7 +12188,7 @@
           <w:b/>
           <w:sz w:val="24"/>
         </w:rPr>
-        <w:t>1. Populasi Tanaman Jeruk Limau</w:t>
+        <w:t>1. Populasi dan Karakteristik Tanaman Jeruk Limau</w:t>
       </w:r>
     </w:p>
     <w:p>
@@ -12046,7 +12202,7 @@
           <w:rFonts w:ascii="Times New Roman" w:hAnsi="Times New Roman"/>
           <w:sz w:val="24"/>
         </w:rPr>
-        <w:t>Lahan ditanami pohon jeruk limau dengan estimasi populasi sekitar 500 hingga 600 pohon, dengan rata-rata tinggi tajuk pohon saat ini berkisar +- 1 meter.</w:t>
+        <w:t>Lahan ditanami pohon jeruk limau (Citrus amblycarpa) dengan estimasi populasi sekitar 500 hingga 600 pohon. Rata-rata tinggi tajuk pohon saat ini berkisar +- 1 meter (tanaman muda/fase pertumbuhan produktif awal). Pohon dipupuk secara periodik dua kali dalam setahun menggunakan pupuk NPK dan pupuk kandang organik.</w:t>
       </w:r>
     </w:p>
     <w:p>
@@ -12062,7 +12218,7 @@
           <w:b/>
           <w:sz w:val="24"/>
         </w:rPr>
-        <w:t>2. Topografi dan Saluran Parit Galian</w:t>
+        <w:t>2. Geometri Lahan dan Saluran Parit Galian</w:t>
       </w:r>
     </w:p>
     <w:p>
@@ -12076,7 +12232,7 @@
           <w:rFonts w:ascii="Times New Roman" w:hAnsi="Times New Roman"/>
           <w:sz w:val="24"/>
         </w:rPr>
-        <w:t>Lahan memiliki 3 lajur parit tanah memanjang dengan panjang masing-masing sekitar 100 meter dan terdapat parit melintang penghubung. Parit dibuat dengan biaya hemat untuk mendekatkan air ke barisan pohon.</w:t>
+        <w:t>Lahan memanjang dengan bentang lintasan ~100 m hingga 117,52 m dan lebar ~25–30 m. Memiliki 3 lajur parit tanah memanjang (lebar 0,5–0,6 m, kedalaman 0,4–0,5 m) dengan parit melintang penghubung. Parit dibuat dengan biaya galian hemat untuk mendekatkan air ke barisan pohon, namun air parit cepat surut dan habis setelah pompa dimatikan akibat rembesan lateral tanah bebas.</w:t>
       </w:r>
     </w:p>
     <w:p>
@@ -12092,7 +12248,7 @@
           <w:b/>
           <w:sz w:val="24"/>
         </w:rPr>
-        <w:t>3. Sumber Suplai Air dan Pompa Mesin</w:t>
+        <w:t>3. Sumber Suplai Air dan Riwayat Pompa Mesin</w:t>
       </w:r>
     </w:p>
     <w:p>
@@ -12106,7 +12262,7 @@
           <w:rFonts w:ascii="Times New Roman" w:hAnsi="Times New Roman"/>
           <w:sz w:val="24"/>
         </w:rPr>
-        <w:t>Air diambil dari aliran sungai/saluran irigasi yang berjarak sekitar 20,54 meter dari batas kebun. Pompa yang digunakan adalah pompa mesin bensin Alkon (Pertalite). Mitra sempat mencoba memodifikasi bahan bakar menggunakan gas LPG 3 kg untuk menghemat biaya, namun dihentikan karena mesin mengalami panas berlebih (overheat).</w:t>
+        <w:t>Air disedot dari aliran sungai/saluran irigasi primer yang berjarak sekitar 20,54 meter dari batas lahan kebun. Pompa yang digunakan adalah pompa mesin bensin Alkon 2 inci (berbahan bakar Pertalite). Mitra sempat mencoba memodifikasi sistem bahan bakar memakai tabung gas LPG 3 kg demi menekan biaya, namun dihentikan permanen karena blok mesin mengalami kenaikan suhu ekstrem (overheating).</w:t>
       </w:r>
     </w:p>
     <w:p>
@@ -12136,7 +12292,7 @@
           <w:rFonts w:ascii="Times New Roman" w:hAnsi="Times New Roman"/>
           <w:sz w:val="24"/>
         </w:rPr>
-        <w:t>Lokasi kebun berada di area sawah/kebun terbuka yang belum terjangkau instalasi tiang listrik tegangan rendah PLN.</w:t>
+        <w:t>Lokasi kebun berada di hamparan lahan persawahan terbuka pedesaan yang belum terjangkau instalasi tiang dan jaringan distribusi listrik tegangan rendah PLN (kondisi off-grid murni).</w:t>
       </w:r>
     </w:p>
     <w:p>
@@ -12166,7 +12322,7 @@
           <w:rFonts w:ascii="Times New Roman" w:hAnsi="Times New Roman"/>
           <w:sz w:val="24"/>
         </w:rPr>
-        <w:t>Air sungai disedot ke dalam parit, kemudian disiramkan ke tanaman secara manual oleh 4 orang pekerja harian lepas menggunakan timba ember kecil.</w:t>
+        <w:t>Air sungai dipompa masuk ke parit galian, kemudian disiramkan ke tanaman secara manual oleh 4 orang pekerja harian lepas menggunakan timba ember kecil bervolume ~5 Liter (masing-masing pohon diguyur 2–3 ember). Proses penyiraman menyita waktu 4 hingga 6 jam per siklus kegiatan.</w:t>
       </w:r>
     </w:p>
     <w:p>
@@ -12182,7 +12338,7 @@
           <w:b/>
           <w:sz w:val="24"/>
         </w:rPr>
-        <w:t>6. Struktur Biaya Upah Tenaga Kerja</w:t>
+        <w:t>6. Struktur Biaya Upah Tenaga Kerja Manual</w:t>
       </w:r>
     </w:p>
     <w:p>
@@ -12196,7 +12352,7 @@
           <w:rFonts w:ascii="Times New Roman" w:hAnsi="Times New Roman"/>
           <w:sz w:val="24"/>
         </w:rPr>
-        <w:t>Upah pekerja adalah Rp100.000 per orang per hari kerja. Total pengeluaran per satu kali kegiatan penyiraman adalah Rp400.000 (4 orang x Rp100.000). Penyiraman dilakukan rutin rata-rata 3 hari sekali pada musim kemarau.</w:t>
+        <w:t>Upah pekerja adalah Rp100.000 per orang per hari kerja. Total pengeluaran per satu kali kegiatan penyiraman adalah Rp400.000 (4 orang x Rp100.000). Penyiraman dilakukan rutin rata-rata 3 hari sekali pada musim kemarau (~10–12 kali/bulan). Estimasi akumulasi upah mencapai Rp48.700.000 per tahun, memberatkan total modal pembukaan lahan mitra (~Rp90 juta).</w:t>
       </w:r>
     </w:p>
     <w:p>
@@ -12226,7 +12382,7 @@
           <w:rFonts w:ascii="Times New Roman" w:hAnsi="Times New Roman"/>
           <w:sz w:val="24"/>
         </w:rPr>
-        <w:t>Petani memperkirakan rata-rata satu pohon menerima sekitar 10 hingga 15 Liter air per kali siram, namun volume aktual per pohon tidak pernah ditakar secara presisi.</w:t>
+        <w:t>Petani memperkirakan rata-rata satu pohon menerima sekitar 10 hingga 15 Liter air per kali siram, namun volume aktual per pohon tidak pernah ditakar secara presisi sehingga terjadi variasi kelembapan tanah yang mencolok antar-zona.</w:t>
       </w:r>
     </w:p>
     <w:p>
@@ -12256,7 +12412,7 @@
           <w:rFonts w:ascii="Times New Roman" w:hAnsi="Times New Roman"/>
           <w:sz w:val="24"/>
         </w:rPr>
-        <w:t>Pengelola menginginkan adanya alat atau sistem otomatis/mekanis yang mampu menggantikan pekerjaan guyur manual tersebut agar pengeluaran upah tenaga kerja dapat dipangkas drastis, serta pasokan air ke pohon menjadi lebih teratur dan terjamin.</w:t>
+        <w:t>Pengelola menginginkan adanya alat atau sistem otomatis/mekanis yang mampu menggantikan pekerjaan guyur manual tersebut agar pengeluaran upah tenaga kerja dapat dipangkas drastis (target biaya operasional &lt;= Rp50.000/siklus), pasokan air ke pohon menjadi teratur dan terjamin, modal lekas kembali dalam 1–2 tahun, serta sistem mudah dioperasikan oleh pekerja lokal tanpa kerumitan teknis.</w:t>
       </w:r>
     </w:p>
     <w:sectPr>

</xml_diff>

<commit_message>
docs(cd2): selaraskan batasan lingkup purwarupa capstone dan rasionalisasi pagu anggaran
- Menegaskan demarkasi batasan skala purwarupa fungsional mahasiswa pada pilot testbed (1 lajur / 15-20 pohon, bentang >= 25 m) dengan rancang bangun modular yang scalable untuk populasi penuh kebun (500-600 pohon, 3.000 m2) pada C-03
- Merasionalisasi plafon biaya investasi awal (S-08) menjadi dua tingkatan: pagu belanja purwarupa riset mahasiswa (<= Rp5.000.000) dan proyeksi investasi adopsi komersial skala penuh mitra (<= Rp18.000.000)
- Menyelaraskan durasi siklus operasional (S-03) pada laju terukur per pohon (<= 28 detik/pohon) dan durasi lajur uji purwarupa (<= 10 menit)
- Memperjelas protokol verifikasi keseragaman Christiansen (S-02) pada 15 pohon sampel uji petak representatif
- Memperbarui Tabel 2, Tabel 3, Tabel 4, narasi spesifikasi, serta prosedur verifikasi di DOCX dan Markdown
</commit_message>
<xml_diff>
--- a/dokumen/cd2/CD2_Jeruk_Limau.docx
+++ b/dokumen/cd2/CD2_Jeruk_Limau.docx
@@ -4071,7 +4071,7 @@
                 <w:rFonts w:ascii="Times New Roman" w:hAnsi="Times New Roman"/>
                 <w:sz w:val="20"/>
               </w:rPr>
-              <w:t>Penyusunan menyeluruh batasan rekayasa dan spesifikasi kuantitatif sistem irigasi jeruk limau berbasis integrasi multi-pilar (kebutuhan riil mitra Ciberes, regulasi tata air nasional, standar industri ASABE/IEC/ISO, literatur agronomi perakaran dan neraca air FAO), penyusunan matriks spesifikasi terukur (S-01 s.d. S-14), protokol pengukuran dan verifikasi, perapian rumus matematis berstandar Word Equation OMML, serta pembersihan istilah dwibahasa sesuai kaidah bahasa Indonesia baku dan huruf miring untuk istilah asing.</w:t>
+              <w:t>Penyusunan menyeluruh batasan rekayasa dan spesifikasi kuantitatif sistem irigasi jeruk limau berbasis integrasi multi-pilar (kebutuhan riil mitra Ciberes, regulasi tata air nasional, standar industri ASABE/IEC/ISO, literatur agronomi perakaran dan neraca air FAO), penetapan demarkasi batasan skala purwarupa fungsional (pilot testbed 15–20 pohon) dengan skalabilitas penuh 600 pohon, penyusunan matriks spesifikasi terukur (S-01 s.d. S-14) dengan rasionalisasi pagu belanja purwarupa mahasiswa (&lt;= Rp5.000.000) serta proyeksi investasi skala penuh mitra (&lt;= Rp18.000.000), protokol pengukuran dan verifikasi, perapian rumus matematis berstandar Word Equation OMML, serta pembersihan istilah dwibahasa sesuai kaidah bahasa Indonesia baku dan huruf miring untuk istilah asing.</w:t>
             </w:r>
           </w:p>
         </w:tc>
@@ -4460,7 +4460,58 @@
           <w:b w:val="0"/>
           <w:sz w:val="24"/>
         </w:rPr>
-        <w:t>). Pendekatan ini memastikan bahwa ruang eksplorasi desain pada tahap CD-3 tetap terbuka luas untuk membandingkan sekurang-kurangnya tiga konsep alternatif solusi—seperti jaringan mikroirigasi perpipaan terotomasi, wahana mekanis gerak semi-otonom berselang, maupun arsitektur hibrida—tanpa penguncian dini pada satu opsi perangkat keras tertentu.</w:t>
+        <w:t>). Selaras dengan ketentuan Buku Panduan Capstone Design FTE Telkom University (2024), ruang lingkup luaran fisik tugas akhir difokuskan pada perancangan dan pembuktian kinerja purwarupa fungsional (</w:t>
+      </w:r>
+      <w:r>
+        <w:rPr>
+          <w:rFonts w:ascii="Times New Roman" w:hAnsi="Times New Roman"/>
+          <w:b w:val="0"/>
+          <w:i/>
+          <w:sz w:val="24"/>
+        </w:rPr>
+        <w:t>functional working prototype</w:t>
+      </w:r>
+      <w:r>
+        <w:rPr>
+          <w:rFonts w:ascii="Times New Roman" w:hAnsi="Times New Roman"/>
+          <w:b w:val="0"/>
+          <w:sz w:val="24"/>
+        </w:rPr>
+        <w:t>) pada petak uji representatif (</w:t>
+      </w:r>
+      <w:r>
+        <w:rPr>
+          <w:rFonts w:ascii="Times New Roman" w:hAnsi="Times New Roman"/>
+          <w:b w:val="0"/>
+          <w:i/>
+          <w:sz w:val="24"/>
+        </w:rPr>
+        <w:t>pilot testbed</w:t>
+      </w:r>
+      <w:r>
+        <w:rPr>
+          <w:rFonts w:ascii="Times New Roman" w:hAnsi="Times New Roman"/>
+          <w:b w:val="0"/>
+          <w:sz w:val="24"/>
+        </w:rPr>
+        <w:t>) kebun mitra, dengan rancang bangun modular yang secara terstruktur dapat diperluas (</w:t>
+      </w:r>
+      <w:r>
+        <w:rPr>
+          <w:rFonts w:ascii="Times New Roman" w:hAnsi="Times New Roman"/>
+          <w:b w:val="0"/>
+          <w:i/>
+          <w:sz w:val="24"/>
+        </w:rPr>
+        <w:t>scalable</w:t>
+      </w:r>
+      <w:r>
+        <w:rPr>
+          <w:rFonts w:ascii="Times New Roman" w:hAnsi="Times New Roman"/>
+          <w:b w:val="0"/>
+          <w:sz w:val="24"/>
+        </w:rPr>
+        <w:t>) untuk mencakup populasi penuh kebun. Pendekatan ini memastikan bahwa ruang eksplorasi desain pada tahap CD-3 tetap terbuka luas untuk membandingkan sekurang-kurangnya tiga konsep alternatif solusi—seperti jaringan mikroirigasi perpipaan terotomasi, wahana mekanis gerak semi-otonom berselang, maupun arsitektur hibrida—tanpa penguncian dini pada satu opsi perangkat keras tertentu.</w:t>
       </w:r>
     </w:p>
     <w:p>
@@ -5720,7 +5771,7 @@
           <w:b/>
           <w:sz w:val="24"/>
         </w:rPr>
-        <w:t>C-03. Kompatibilitas Geometri dan Topografi Kebun</w:t>
+        <w:t>C-03. Kompatibilitas Geometri, Batasan Skala Purwarupa, dan Skalabilitas Sistem</w:t>
       </w:r>
     </w:p>
     <w:p>
@@ -5735,7 +5786,41 @@
           <w:b w:val="0"/>
           <w:sz w:val="24"/>
         </w:rPr>
-        <w:t>Sistem harus mampu melayani area kebun dengan populasi 500–600 pohon pada rentang lintasan memanjang 100–117,52 meter tanpa merusak batang tanaman, tajuk buah, maupun jaringan perakaran dangkal.</w:t>
+        <w:t>Sistem purwarupa fungsional Capstone diwajibkan beroperasi dan membuktikan kinerja penyiraman secara empiris pada petak uji representatif (</w:t>
+      </w:r>
+      <w:r>
+        <w:rPr>
+          <w:rFonts w:ascii="Times New Roman" w:hAnsi="Times New Roman"/>
+          <w:b w:val="0"/>
+          <w:i/>
+          <w:sz w:val="24"/>
+        </w:rPr>
+        <w:t>pilot testbed</w:t>
+      </w:r>
+      <w:r>
+        <w:rPr>
+          <w:rFonts w:ascii="Times New Roman" w:hAnsi="Times New Roman"/>
+          <w:b w:val="0"/>
+          <w:sz w:val="24"/>
+        </w:rPr>
+        <w:t>) kebun jeruk limau mitra di Ciberes, yaitu sekurang-kurangnya 1 lajur barisan pohon percontohan (15–20 pohon pada bentang operasional &gt;= 25 meter) dengan kontur tanah parit pertanian terbuka. Di samping itu, rancang bangun arsitektur mekanikal, elektrikal, dan perpipaan/aktuator purwarupa wajib bersifat modular sehingga terbukti secara teknis dapat diskalakan (</w:t>
+      </w:r>
+      <w:r>
+        <w:rPr>
+          <w:rFonts w:ascii="Times New Roman" w:hAnsi="Times New Roman"/>
+          <w:b w:val="0"/>
+          <w:i/>
+          <w:sz w:val="24"/>
+        </w:rPr>
+        <w:t>scalable</w:t>
+      </w:r>
+      <w:r>
+        <w:rPr>
+          <w:rFonts w:ascii="Times New Roman" w:hAnsi="Times New Roman"/>
+          <w:b w:val="0"/>
+          <w:sz w:val="24"/>
+        </w:rPr>
+        <w:t>) untuk mencakup populasi penuh 500–600 pohon pada lahan memanjang 100–117,52 meter seluas ~3.000 m² tanpa merusak batang tanaman, tajuk buah, maupun zona perakaran dangkal.</w:t>
       </w:r>
     </w:p>
     <w:p>
@@ -6469,7 +6554,7 @@
                 <w:b w:val="0"/>
                 <w:sz w:val="18"/>
               </w:rPr>
-              <w:t>&lt;= 4,0</w:t>
+              <w:t>&lt;= 4,0 (Skala penuh)</w:t>
             </w:r>
           </w:p>
         </w:tc>
@@ -7248,7 +7333,7 @@
                 <w:b w:val="0"/>
                 <w:sz w:val="18"/>
               </w:rPr>
-              <w:t>Batas Biaya Investasi Awal (CAPEX)</w:t>
+              <w:t>Plafon Biaya Modal Purwarupa &amp; Skala Penuh</w:t>
             </w:r>
           </w:p>
         </w:tc>
@@ -7274,7 +7359,7 @@
                 <w:b w:val="0"/>
                 <w:sz w:val="18"/>
               </w:rPr>
-              <w:t>&lt;= 18.000.000</w:t>
+              <w:t>Purwarupa &lt;= 5.000.000; Penuh &lt;= 18.000.000</w:t>
             </w:r>
           </w:p>
         </w:tc>
@@ -7352,7 +7437,7 @@
                 <w:b w:val="0"/>
                 <w:sz w:val="18"/>
               </w:rPr>
-              <w:t>Analisis Kelayakan Modal Usaha Tani &amp; BOM Riil</w:t>
+              <w:t>Pagu Anggaran Riset Mahasiswa &amp; Analisis Modal Tani [30]</w:t>
             </w:r>
           </w:p>
         </w:tc>
@@ -8557,7 +8642,7 @@
           <w:b w:val="0"/>
           <w:sz w:val="24"/>
         </w:rPr>
-        <w:t>Seluruh proses penyiraman untuk 500–600 pohon harus dapat dituntaskan dalam waktu kurang dari atau sama dengan 4 jam per siklus kegiatan. Hal ini memberikan efisiensi waktu yang masif dibandingkan metode manual 4 orang buruh yang menyita waktu seharian penuh, serta memanfaatkan waktu siram ideal (pagi hari sebelum pukul 10.00 WIB atau sore hari setelah pukul 15.00 WIB) guna meminimalkan kehilangan air akibat evaporasi radiasi matahari langsung [25].</w:t>
+        <w:t>Seluruh proses penyiraman untuk 500–600 pohon pada skala penuh harus dapat dituntaskan dalam waktu kurang dari atau sama dengan 4 jam per siklus kegiatan (ekuivalen laju siram rata-rata &lt;= 24–28 detik per pohon, atau durasi &lt;= 8–10 menit untuk 15–20 pohon percontohan pada purwarupa uji). Hal ini memberikan efisiensi waktu yang masif dibandingkan metode manual 4 orang buruh yang menyita waktu seharian penuh, serta memanfaatkan waktu siram ideal (pagi hari sebelum pukul 10.00 WIB atau sore hari setelah pukul 15.00 WIB) guna meminimalkan kehilangan air akibat evaporasi radiasi matahari langsung [25].</w:t>
       </w:r>
     </w:p>
     <w:p>
@@ -8921,7 +9006,7 @@
           <w:b/>
           <w:sz w:val="24"/>
         </w:rPr>
-        <w:t>S-08. Batas Biaya Investasi Awal Sistem (CAPEX)</w:t>
+        <w:t>S-08. Plafon Biaya Investasi Awal Purwarupa dan Proyeksi Skala Penuh (CAPEX)</w:t>
       </w:r>
     </w:p>
     <w:p>
@@ -8936,7 +9021,41 @@
           <w:b w:val="0"/>
           <w:sz w:val="24"/>
         </w:rPr>
-        <w:t>Total biaya rancang bangun, belanja komponen, fabrikasi struktural, instalasi sistem, dan instrumentasi dibatasi maksimal Rp18.000.000. Angka batas atas ini ditetapkan secara rasional agar investasi terjangkau oleh petani skala menengah dan tidak melebihi alokasi dana kelayakan modal usaha tani.</w:t>
+        <w:t>Spesifikasi biaya investasi awal dibedakan secara tegas ke dalam dua tingkatan akuntabilitas rekayasa: (a) Plafon Biaya Modal Purwarupa Mahasiswa (</w:t>
+      </w:r>
+      <w:r>
+        <w:rPr>
+          <w:rFonts w:ascii="Times New Roman" w:hAnsi="Times New Roman"/>
+          <w:b w:val="0"/>
+          <w:i/>
+          <w:sz w:val="24"/>
+        </w:rPr>
+        <w:t>Prototyping CAPEX</w:t>
+      </w:r>
+      <w:r>
+        <w:rPr>
+          <w:rFonts w:ascii="Times New Roman" w:hAnsi="Times New Roman"/>
+          <w:b w:val="0"/>
+          <w:sz w:val="24"/>
+        </w:rPr>
+        <w:t>): Realisasi pengadaan modul elektronika, pompa mikro, instrumentasi sensor, baterai, panel surya uji, dan fabrikasi struktural purwarupa fungsional untuk petak uji percontohan (15–20 pohon) dibatasi maksimal Rp5.000.000. Plafon ini sangat realistis dan terjangkau bagi pembiayaan mandiri maupun hibah tugas akhir mahasiswa tanpa mengurangi validitas pengujian fungsional di lapangan. (b) Proyeksi Biaya Implementasi Skala Penuh Kebun (</w:t>
+      </w:r>
+      <w:r>
+        <w:rPr>
+          <w:rFonts w:ascii="Times New Roman" w:hAnsi="Times New Roman"/>
+          <w:b w:val="0"/>
+          <w:i/>
+          <w:sz w:val="24"/>
+        </w:rPr>
+        <w:t>Full-Scale Commercial CAPEX</w:t>
+      </w:r>
+      <w:r>
+        <w:rPr>
+          <w:rFonts w:ascii="Times New Roman" w:hAnsi="Times New Roman"/>
+          <w:b w:val="0"/>
+          <w:sz w:val="24"/>
+        </w:rPr>
+        <w:t>): Berdasarkan estimasi perbanyakan modular untuk melayani seluruh 500–600 pohon di lahan ~3.000 m², batas atas biaya pengadaan perangkat dan instalasi komersial ditetapkan maksimal Rp18.000.000. Angka batas atas komersial ini dihitung berdasarkan alokasi modal usaha tani kebun mitra agar memenuhi kriteria pengembalian modal investasi yang rasional (S-10) [30], [31].</w:t>
       </w:r>
     </w:p>
     <w:p>
@@ -8998,7 +9117,7 @@
           <w:b w:val="0"/>
           <w:sz w:val="24"/>
         </w:rPr>
-        <w:t>Kelayakan ekonomi sistem rekayasa dinilai berdasarkan kecepatan pengembalian modal investasi awal (</w:t>
+        <w:t>Kelayakan ekonomi sistem dinilai berdasarkan kecepatan pengembalian modal investasi awal (</w:t>
       </w:r>
       <w:r>
         <w:rPr>
@@ -9083,7 +9202,7 @@
           <w:b w:val="0"/>
           <w:sz w:val="24"/>
         </w:rPr>
-        <w:t>Di mana PP adalah periode pengembalian modal (dalam tahun atau bulan), CAPEX adalah modal investasi awal sistem rekayasa (&lt;= Rp18.000.000), dan Delta OPEX_tahunan adalah selisih penghematan biaya operasional tahunan antara metode manual eksisting (Rp400.000/kegiatan x ~120 siklus/tahun = ~Rp48.000.000/tahun) dengan biaya operasional sistem baru (&lt;= Rp50.000/siklus x ~120 siklus/tahun = &lt;= Rp6.000.000/tahun). Dengan selisih penghematan bersih mencapai lebih dari Rp42.000.000 per tahun, target titik impas modal dipastikan tercapai dalam kurun waktu 12 hingga 18 bulan operasi [30].</w:t>
+        <w:t>Di mana PP adalah periode pengembalian modal (dalam tahun atau bulan), CAPEX adalah modal investasi implementasi skala penuh sistem rekayasa (&lt;= Rp18.000.000), dan Delta OPEX_tahunan adalah selisih penghematan biaya operasional tahunan antara metode manual eksisting (Rp400.000/kegiatan x ~120 siklus/tahun = ~Rp48.000.000/tahun) dengan biaya operasional sistem baru (&lt;= Rp50.000/siklus x ~120 siklus/tahun = &lt;= Rp6.000.000/tahun). Dengan selisih penghematan bersih mencapai lebih dari Rp42.000.000 per tahun, target titik impas modal investasi penuh dipastikan tercapai dalam kurun waktu 12 hingga 18 bulan operasi [30]. Sementara itu, untuk purwarupa fungsional Capstone mahasiswa dengan pagu belanja &lt;= Rp5.000.000, kelayakan biaya terbukti sangat efisien sebagai prototipe pembuktian konsep sebelum investasi penuh digelontorkan oleh mitra.</w:t>
       </w:r>
     </w:p>
     <w:p>
@@ -9962,7 +10081,7 @@
                 <w:b w:val="0"/>
                 <w:sz w:val="18"/>
               </w:rPr>
-              <w:t>&lt;= 4,0 Jam</w:t>
+              <w:t>&lt;= 4,0 Jam (Skala penuh)</w:t>
             </w:r>
           </w:p>
         </w:tc>
@@ -9988,7 +10107,7 @@
                 <w:b w:val="0"/>
                 <w:sz w:val="18"/>
               </w:rPr>
-              <w:t>Pencatatan Waktu Siklus Penuh</w:t>
+              <w:t>Pencatatan Waktu Siklus / Laju per Pohon</w:t>
             </w:r>
           </w:p>
         </w:tc>
@@ -10040,7 +10159,7 @@
                 <w:b w:val="0"/>
                 <w:sz w:val="18"/>
               </w:rPr>
-              <w:t>Waktu selesai siram &lt;= 240 menit.</w:t>
+              <w:t>Laju siram &lt;= 28 dtk/pohon; siram 1 lajur &lt;= 10 mnt.</w:t>
             </w:r>
           </w:p>
         </w:tc>
@@ -10741,7 +10860,7 @@
                 <w:b w:val="0"/>
                 <w:sz w:val="18"/>
               </w:rPr>
-              <w:t>Biaya Investasi (CAPEX)</w:t>
+              <w:t>Biaya Modal (CAPEX)</w:t>
             </w:r>
           </w:p>
         </w:tc>
@@ -10767,7 +10886,7 @@
                 <w:b w:val="0"/>
                 <w:sz w:val="18"/>
               </w:rPr>
-              <w:t>&lt;= Rp 18.000.000</w:t>
+              <w:t>Purwarupa &lt;= Rp 5 Jt; Penuh &lt;= Rp 18 Jt</w:t>
             </w:r>
           </w:p>
         </w:tc>
@@ -10793,7 +10912,7 @@
                 <w:b w:val="0"/>
                 <w:sz w:val="18"/>
               </w:rPr>
-              <w:t>Audit Finansial BOM Riil</w:t>
+              <w:t>Audit Nota BOM Purwarupa &amp; Analisis Finansial</w:t>
             </w:r>
           </w:p>
         </w:tc>
@@ -10819,7 +10938,7 @@
                 <w:b w:val="0"/>
                 <w:sz w:val="18"/>
               </w:rPr>
-              <w:t>Rekapitulasi nota &amp; faktur pengadaan resmi</w:t>
+              <w:t>Rekapitulasi nota belanja riil &amp; simulasi biaya skala penuh</w:t>
             </w:r>
           </w:p>
         </w:tc>
@@ -10845,7 +10964,7 @@
                 <w:b w:val="0"/>
                 <w:sz w:val="18"/>
               </w:rPr>
-              <w:t>Total belanja riil &lt;= plafon anggaran.</w:t>
+              <w:t>Belanja purwarupa &lt;= Rp 5.000.000; Proyeksi skala penuh &lt;= Rp 18.000.000.</w:t>
             </w:r>
           </w:p>
         </w:tc>
@@ -11860,7 +11979,24 @@
           <w:b w:val="0"/>
           <w:sz w:val="24"/>
         </w:rPr>
-        <w:t>Sebanyak 15 titik pohon sampel ditetapkan secara acak terstratifikasi mewakili tiga zona hidrolik: 5 pohon di baris awal (dekat titik suplai air), 5 pohon di zona tengah (jarak ~50 m), dan 5 pohon di baris ujung parit (jarak ~100 m). Pada setiap pohon sampel diletakkan bejana penampung ukur (</w:t>
+        <w:t>Sebanyak 15 titik pohon sampel ditetapkan pada lajur petak uji percontohan (</w:t>
+      </w:r>
+      <w:r>
+        <w:rPr>
+          <w:rFonts w:ascii="Times New Roman" w:hAnsi="Times New Roman"/>
+          <w:b w:val="0"/>
+          <w:i/>
+          <w:sz w:val="24"/>
+        </w:rPr>
+        <w:t>pilot testbed</w:t>
+      </w:r>
+      <w:r>
+        <w:rPr>
+          <w:rFonts w:ascii="Times New Roman" w:hAnsi="Times New Roman"/>
+          <w:b w:val="0"/>
+          <w:sz w:val="24"/>
+        </w:rPr>
+        <w:t>) mewakili tiga zona hidrolik: 5 pohon di zona pangkal (dekat titik suplai air), 5 pohon di zona tengah (bentang ~12–15 m), dan 5 pohon di zona ujung lajur uji (bentang ~25 m). Pada setiap pohon sampel diletakkan bejana penampung ukur (</w:t>
       </w:r>
       <w:r>
         <w:rPr>
@@ -12158,7 +12294,7 @@
           <w:b/>
           <w:sz w:val="24"/>
         </w:rPr>
-        <w:t>1. Audit Biaya Investasi Awal (CAPEX)</w:t>
+        <w:t>1. Audit Biaya Modal Purwarupa dan Simulasi Finansial (CAPEX)</w:t>
       </w:r>
     </w:p>
     <w:p>
@@ -12173,7 +12309,24 @@
           <w:b w:val="0"/>
           <w:sz w:val="24"/>
         </w:rPr>
-        <w:t>Biaya investasi awal (CAPEX) diverifikasi melalui audit dokumen rincian anggaran komponen berdasarkan total rekapitulasi nota belanja komponen riil dan ongkos fabrikasi bengkel lokal, yang harus terbukti &lt;= Rp18.000.000.</w:t>
+        <w:t>Biaya investasi awal diverifikasi melalui dua tahapan: (a) audit dokumen rincian anggaran komponen riil (</w:t>
+      </w:r>
+      <w:r>
+        <w:rPr>
+          <w:rFonts w:ascii="Times New Roman" w:hAnsi="Times New Roman"/>
+          <w:b w:val="0"/>
+          <w:i/>
+          <w:sz w:val="24"/>
+        </w:rPr>
+        <w:t>bill of materials</w:t>
+      </w:r>
+      <w:r>
+        <w:rPr>
+          <w:rFonts w:ascii="Times New Roman" w:hAnsi="Times New Roman"/>
+          <w:b w:val="0"/>
+          <w:sz w:val="24"/>
+        </w:rPr>
+        <w:t xml:space="preserve"> / BOM) purwarupa fungsional mahasiswa berdasarkan total rekapitulasi nota belanja komponen dan ongkos perakitan mekanis yang wajib terbukti &lt;= Rp5.000.000, serta (b) validasi matematis pemodelan biaya ekspansi skala penuh kebun (&lt;= Rp18.000.000) menggunakan data harga satuan komponen percontohan.</w:t>
       </w:r>
     </w:p>
     <w:p>
@@ -12484,7 +12637,7 @@
           <w:b w:val="0"/>
           <w:sz w:val="24"/>
         </w:rPr>
-        <w:t>Ditetapkan 5 batasan mutlak dan 14 butir spesifikasi kuantitatif komprehensif yang mencakup aspek teknis (akurasi dosis air 15 L +- 5%, keseragaman CU &gt;= 85%, durasi siram &lt;= 4 jam, filtrasi 120 mesh, otonomi energi &gt;= 8 jam, rating IP65), aspek ekonomi (CAPEX &lt;= Rp18.000.000, OPEX &lt;= Rp50.000/siklus, payback period &lt;= 12–18 bulan), aspek lingkungan (efisiensi aplikasi air &gt;= 80%, bebas emisi lokal di area perakaran), serta aspek operasional mitra (waktu ajar operasi &lt;= 30 menit, waktu perawatan &lt;= 20 menit/bulan).</w:t>
+        <w:t>Ditetapkan 5 batasan mutlak dan 14 butir spesifikasi kuantitatif komprehensif yang mencakup aspek teknis (akurasi dosis air 15 L +- 5%, keseragaman CU &gt;= 85%, durasi siram &lt;= 4 jam skala penuh / laju &lt;= 28 detik/pohon, filtrasi 120 mesh, otonomi energi &gt;= 8 jam, rating IP65), aspek ekonomi (plafon biaya belanja purwarupa mahasiswa &lt;= Rp5.000.000, proyeksi implementasi skala penuh kebun &lt;= Rp18.000.000, OPEX &lt;= Rp50.000/siklus, payback period &lt;= 12–18 bulan), aspek lingkungan (efisiensi aplikasi air &gt;= 80%, bebas emisi lokal di area perakaran), serta aspek operasional mitra (waktu ajar operasi &lt;= 30 menit, waktu perawatan &lt;= 20 menit/bulan).</w:t>
       </w:r>
     </w:p>
     <w:p>

</xml_diff>